<commit_message>
New Lesson 8 Report Done
</commit_message>
<xml_diff>
--- a/Lesson8/Lesson8Report.docx
+++ b/Lesson8/Lesson8Report.docx
@@ -2,7 +2,2838 @@
 <file path=word/document.xml><?xml version="1.0" encoding="utf-8"?>
 <w:document xmlns:wpc="http://schemas.microsoft.com/office/word/2010/wordprocessingCanvas" xmlns:cx="http://schemas.microsoft.com/office/drawing/2014/chartex" xmlns:cx1="http://schemas.microsoft.com/office/drawing/2015/9/8/chartex" xmlns:cx2="http://schemas.microsoft.com/office/drawing/2015/10/21/chartex" xmlns:cx3="http://schemas.microsoft.com/office/drawing/2016/5/9/chartex" xmlns:cx4="http://schemas.microsoft.com/office/drawing/2016/5/10/chartex" xmlns:cx5="http://schemas.microsoft.com/office/drawing/2016/5/11/chartex" xmlns:cx6="http://schemas.microsoft.com/office/drawing/2016/5/12/chartex" xmlns:cx7="http://schemas.microsoft.com/office/drawing/2016/5/13/chartex" xmlns:cx8="http://schemas.microsoft.com/office/drawing/2016/5/14/chartex" xmlns:mc="http://schemas.openxmlformats.org/markup-compatibility/2006" xmlns:aink="http://schemas.microsoft.com/office/drawing/2016/ink" xmlns:am3d="http://schemas.microsoft.com/office/drawing/2017/model3d" xmlns:o="urn:schemas-microsoft-com:office:office" xmlns:oel="http://schemas.microsoft.com/office/2019/extlst" xmlns:r="http://schemas.openxmlformats.org/officeDocument/2006/relationships" xmlns:m="http://schemas.openxmlformats.org/officeDocument/2006/math" xmlns:v="urn:schemas-microsoft-com:vml" xmlns:wp14="http://schemas.microsoft.com/office/word/2010/wordprocessingDrawing" xmlns:wp="http://schemas.openxmlformats.org/drawingml/2006/wordprocessingDrawing" xmlns:w10="urn:schemas-microsoft-com:office:word" xmlns:w="http://schemas.openxmlformats.org/wordprocessingml/2006/main" xmlns:w14="http://schemas.microsoft.com/office/word/2010/wordml" xmlns:w15="http://schemas.microsoft.com/office/word/2012/wordml" xmlns:w16cex="http://schemas.microsoft.com/office/word/2018/wordml/cex" xmlns:w16cid="http://schemas.microsoft.com/office/word/2016/wordml/cid" xmlns:w16="http://schemas.microsoft.com/office/word/2018/wordml" xmlns:w16du="http://schemas.microsoft.com/office/word/2023/wordml/word16du" xmlns:w16sdtdh="http://schemas.microsoft.com/office/word/2020/wordml/sdtdatahash" xmlns:w16sdtfl="http://schemas.microsoft.com/office/word/2024/wordml/sdtformatlock" xmlns:w16se="http://schemas.microsoft.com/office/word/2015/wordml/symex" xmlns:wpg="http://schemas.microsoft.com/office/word/2010/wordprocessingGroup" xmlns:wpi="http://schemas.microsoft.com/office/word/2010/wordprocessingInk" xmlns:wne="http://schemas.microsoft.com/office/word/2006/wordml" xmlns:wps="http://schemas.microsoft.com/office/word/2010/wordprocessingShape" mc:Ignorable="w14 w15 w16se w16cid w16 w16cex w16sdtdh w16sdtfl w16du wp14">
   <w:body>
+    <w:p>
+      <w:pPr>
+        <w:jc w:val="center"/>
+        <w:rPr>
+          <w:rFonts w:asciiTheme="majorBidi" w:hAnsiTheme="majorBidi" w:cstheme="majorBidi"/>
+          <w:b/>
+          <w:bCs/>
+          <w:i/>
+          <w:iCs/>
+          <w:sz w:val="72"/>
+          <w:szCs w:val="72"/>
+        </w:rPr>
+      </w:pPr>
+    </w:p>
+    <w:p>
+      <w:pPr>
+        <w:jc w:val="center"/>
+        <w:rPr>
+          <w:rFonts w:asciiTheme="majorBidi" w:hAnsiTheme="majorBidi" w:cstheme="majorBidi"/>
+          <w:b/>
+          <w:bCs/>
+          <w:i/>
+          <w:iCs/>
+          <w:sz w:val="72"/>
+          <w:szCs w:val="72"/>
+        </w:rPr>
+      </w:pPr>
+    </w:p>
+    <w:p>
+      <w:pPr>
+        <w:jc w:val="center"/>
+        <w:rPr>
+          <w:rFonts w:asciiTheme="majorBidi" w:hAnsiTheme="majorBidi" w:cstheme="majorBidi"/>
+          <w:b/>
+          <w:bCs/>
+          <w:i/>
+          <w:iCs/>
+          <w:sz w:val="72"/>
+          <w:szCs w:val="72"/>
+        </w:rPr>
+      </w:pPr>
+      <w:r>
+        <w:rPr>
+          <w:rFonts w:asciiTheme="majorBidi" w:hAnsiTheme="majorBidi" w:cstheme="majorBidi"/>
+          <w:b/>
+          <w:bCs/>
+          <w:i/>
+          <w:iCs/>
+          <w:sz w:val="72"/>
+          <w:szCs w:val="72"/>
+        </w:rPr>
+        <w:t>ICS344-0</w:t>
+      </w:r>
+      <w:r>
+        <w:rPr>
+          <w:rFonts w:asciiTheme="majorBidi" w:hAnsiTheme="majorBidi" w:cstheme="majorBidi"/>
+          <w:b/>
+          <w:bCs/>
+          <w:i/>
+          <w:iCs/>
+          <w:sz w:val="72"/>
+          <w:szCs w:val="72"/>
+        </w:rPr>
+        <w:t>3</w:t>
+      </w:r>
+      <w:r>
+        <w:rPr>
+          <w:rFonts w:asciiTheme="majorBidi" w:hAnsiTheme="majorBidi" w:cstheme="majorBidi"/>
+          <w:b/>
+          <w:bCs/>
+          <w:i/>
+          <w:iCs/>
+          <w:sz w:val="72"/>
+          <w:szCs w:val="72"/>
+        </w:rPr>
+        <w:t xml:space="preserve"> Project</w:t>
+      </w:r>
+    </w:p>
+    <w:p>
+      <w:pPr>
+        <w:jc w:val="center"/>
+        <w:rPr>
+          <w:sz w:val="40"/>
+          <w:szCs w:val="40"/>
+        </w:rPr>
+      </w:pPr>
+      <w:r>
+        <w:rPr>
+          <w:sz w:val="40"/>
+          <w:szCs w:val="40"/>
+        </w:rPr>
+        <w:t xml:space="preserve">Saad </w:t>
+      </w:r>
+      <w:proofErr w:type="gramStart"/>
+      <w:r>
+        <w:rPr>
+          <w:sz w:val="40"/>
+          <w:szCs w:val="40"/>
+        </w:rPr>
+        <w:t>W.(</w:t>
+      </w:r>
+      <w:proofErr w:type="gramEnd"/>
+      <w:r>
+        <w:rPr>
+          <w:sz w:val="40"/>
+          <w:szCs w:val="40"/>
+        </w:rPr>
+        <w:t xml:space="preserve">202337730) and Mohamed </w:t>
+      </w:r>
+      <w:proofErr w:type="gramStart"/>
+      <w:r>
+        <w:rPr>
+          <w:sz w:val="40"/>
+          <w:szCs w:val="40"/>
+        </w:rPr>
+        <w:t>K.(</w:t>
+      </w:r>
+      <w:proofErr w:type="gramEnd"/>
+      <w:r>
+        <w:rPr>
+          <w:sz w:val="40"/>
+          <w:szCs w:val="40"/>
+        </w:rPr>
+        <w:t>202338790)</w:t>
+      </w:r>
+    </w:p>
+    <w:p>
+      <w:pPr>
+        <w:jc w:val="center"/>
+        <w:rPr>
+          <w:color w:val="215E99" w:themeColor="text2" w:themeTint="BF"/>
+        </w:rPr>
+      </w:pPr>
+      <w:hyperlink r:id="rId6" w:history="1">
+        <w:r>
+          <w:rPr>
+            <w:rStyle w:val="Hyperlink"/>
+            <w:color w:val="68A0B0" w:themeColor="hyperlink" w:themeTint="BF"/>
+          </w:rPr>
+          <w:t>http://dvsa-website-project-238043187633-us-east-1.s3-website.us-east-1.amazonaws.com/cart</w:t>
+        </w:r>
+      </w:hyperlink>
+    </w:p>
+    <w:p>
+      <w:pPr>
+        <w:jc w:val="center"/>
+        <w:rPr>
+          <w:color w:val="215E99" w:themeColor="text2" w:themeTint="BF"/>
+        </w:rPr>
+      </w:pPr>
+      <w:r>
+        <w:rPr>
+          <w:color w:val="215E99" w:themeColor="text2" w:themeTint="BF"/>
+        </w:rPr>
+        <w:t>US-EAST-1</w:t>
+      </w:r>
+    </w:p>
+    <w:p>
+      <w:pPr>
+        <w:jc w:val="center"/>
+        <w:rPr>
+          <w:color w:val="215E99" w:themeColor="text2" w:themeTint="BF"/>
+        </w:rPr>
+      </w:pPr>
+      <w:r>
+        <w:rPr>
+          <w:color w:val="215E99" w:themeColor="text2" w:themeTint="BF"/>
+        </w:rPr>
+        <w:t>15-4-2026</w:t>
+      </w:r>
+    </w:p>
+    <w:p>
+      <w:pPr>
+        <w:jc w:val="center"/>
+        <w:rPr>
+          <w:color w:val="215E99" w:themeColor="text2" w:themeTint="BF"/>
+        </w:rPr>
+      </w:pPr>
+      <w:r>
+        <w:rPr>
+          <w:color w:val="215E99" w:themeColor="text2" w:themeTint="BF"/>
+        </w:rPr>
+        <w:t xml:space="preserve">Lesson </w:t>
+      </w:r>
+      <w:r>
+        <w:rPr>
+          <w:color w:val="215E99" w:themeColor="text2" w:themeTint="BF"/>
+        </w:rPr>
+        <w:t>8</w:t>
+      </w:r>
+      <w:r>
+        <w:rPr>
+          <w:color w:val="215E99" w:themeColor="text2" w:themeTint="BF"/>
+        </w:rPr>
+        <w:t xml:space="preserve">: </w:t>
+      </w:r>
+      <w:r>
+        <w:rPr>
+          <w:color w:val="215E99" w:themeColor="text2" w:themeTint="BF"/>
+        </w:rPr>
+        <w:t xml:space="preserve">Logical </w:t>
+      </w:r>
+      <w:r>
+        <w:rPr>
+          <w:color w:val="215E99" w:themeColor="text2" w:themeTint="BF"/>
+        </w:rPr>
+        <w:t>Vulnerability</w:t>
+      </w:r>
+    </w:p>
     <w:p/>
+    <w:p/>
+    <w:p/>
+    <w:p/>
+    <w:p/>
+    <w:p/>
+    <w:p/>
+    <w:p/>
+    <w:p/>
+    <w:p/>
+    <w:p/>
+    <w:p/>
+    <w:p/>
+    <w:p>
+      <w:pPr>
+        <w:spacing w:before="100" w:beforeAutospacing="1" w:after="100" w:afterAutospacing="1" w:line="240" w:lineRule="auto"/>
+        <w:jc w:val="center"/>
+        <w:outlineLvl w:val="1"/>
+        <w:rPr>
+          <w:rFonts w:ascii="Times New Roman" w:eastAsia="Times New Roman" w:hAnsi="Times New Roman" w:cs="Times New Roman"/>
+          <w:b/>
+          <w:bCs/>
+          <w:i/>
+          <w:iCs/>
+          <w:kern w:val="0"/>
+          <w:sz w:val="36"/>
+          <w:szCs w:val="36"/>
+          <w:lang w:val="en-SA"/>
+          <w14:ligatures w14:val="none"/>
+        </w:rPr>
+      </w:pPr>
+      <w:r>
+        <w:rPr>
+          <w:rFonts w:ascii="Times New Roman" w:eastAsia="Times New Roman" w:hAnsi="Times New Roman" w:cs="Times New Roman"/>
+          <w:b/>
+          <w:bCs/>
+          <w:i/>
+          <w:iCs/>
+          <w:kern w:val="0"/>
+          <w:sz w:val="36"/>
+          <w:szCs w:val="36"/>
+          <w:lang w:val="en-SA"/>
+          <w14:ligatures w14:val="none"/>
+        </w:rPr>
+        <w:lastRenderedPageBreak/>
+        <w:t>Goal and Vulnerability Summary</w:t>
+      </w:r>
+    </w:p>
+    <w:p>
+      <w:pPr>
+        <w:spacing w:before="100" w:beforeAutospacing="1" w:after="100" w:afterAutospacing="1" w:line="240" w:lineRule="auto"/>
+        <w:rPr>
+          <w:rFonts w:ascii="Times New Roman" w:eastAsia="Times New Roman" w:hAnsi="Times New Roman" w:cs="Times New Roman"/>
+          <w:kern w:val="0"/>
+          <w:lang w:val="en-SA"/>
+          <w14:ligatures w14:val="none"/>
+        </w:rPr>
+      </w:pPr>
+      <w:r>
+        <w:rPr>
+          <w:rFonts w:ascii="Times New Roman" w:eastAsia="Times New Roman" w:hAnsi="Times New Roman" w:cs="Times New Roman"/>
+          <w:kern w:val="0"/>
+          <w:lang w:val="en-SA"/>
+          <w14:ligatures w14:val="none"/>
+        </w:rPr>
+        <w:t>This lesson demonstrates a logic vulnerability in the DVSA application caused by improper handling of request sequencing. The main affected component is the order processing logic within the AWS Lambda backend, which handles billing and order updates through API Gateway. The vulnerability allows an attacker to manipulate the order contents during the billing process by sending out-of-order requests. As a result, the attacker can pay for a smaller quantity of items while receiving a larger quantity in the final order. The main weakness is the lack of synchronization between billing and update operations, leading to inconsistent application state.</w:t>
+      </w:r>
+    </w:p>
+    <w:p>
+      <w:pPr>
+        <w:spacing w:after="0" w:line="240" w:lineRule="auto"/>
+        <w:rPr>
+          <w:rFonts w:ascii="Times New Roman" w:eastAsia="Times New Roman" w:hAnsi="Times New Roman" w:cs="Times New Roman"/>
+          <w:kern w:val="0"/>
+          <w:lang w:val="en-SA"/>
+          <w14:ligatures w14:val="none"/>
+        </w:rPr>
+      </w:pPr>
+      <w:r>
+        <w:rPr>
+          <w:rFonts w:ascii="Times New Roman" w:eastAsia="Times New Roman" w:hAnsi="Times New Roman" w:cs="Times New Roman"/>
+          <w:noProof/>
+          <w:kern w:val="0"/>
+          <w:lang w:val="en-SA"/>
+        </w:rPr>
+        <w:pict w14:anchorId="217E27C4">
+          <v:rect id="_x0000_i1040" alt="" style="width:468pt;height:.05pt;mso-width-percent:0;mso-height-percent:0;mso-width-percent:0;mso-height-percent:0" o:hralign="center" o:hrstd="t" o:hr="t" fillcolor="#a0a0a0" stroked="f"/>
+        </w:pict>
+      </w:r>
+    </w:p>
+    <w:p>
+      <w:pPr>
+        <w:spacing w:before="100" w:beforeAutospacing="1" w:after="100" w:afterAutospacing="1" w:line="240" w:lineRule="auto"/>
+        <w:jc w:val="center"/>
+        <w:outlineLvl w:val="1"/>
+        <w:rPr>
+          <w:rFonts w:ascii="Times New Roman" w:eastAsia="Times New Roman" w:hAnsi="Times New Roman" w:cs="Times New Roman"/>
+          <w:b/>
+          <w:bCs/>
+          <w:i/>
+          <w:iCs/>
+          <w:kern w:val="0"/>
+          <w:sz w:val="36"/>
+          <w:szCs w:val="36"/>
+          <w:lang w:val="en-SA"/>
+          <w14:ligatures w14:val="none"/>
+        </w:rPr>
+      </w:pPr>
+      <w:r>
+        <w:rPr>
+          <w:rFonts w:ascii="Times New Roman" w:eastAsia="Times New Roman" w:hAnsi="Times New Roman" w:cs="Times New Roman"/>
+          <w:b/>
+          <w:bCs/>
+          <w:i/>
+          <w:iCs/>
+          <w:kern w:val="0"/>
+          <w:sz w:val="36"/>
+          <w:szCs w:val="36"/>
+          <w:lang w:val="en-SA"/>
+          <w14:ligatures w14:val="none"/>
+        </w:rPr>
+        <w:t>Why This Works / Root Cause</w:t>
+      </w:r>
+    </w:p>
+    <w:p>
+      <w:pPr>
+        <w:spacing w:before="100" w:beforeAutospacing="1" w:after="100" w:afterAutospacing="1" w:line="240" w:lineRule="auto"/>
+        <w:rPr>
+          <w:rFonts w:ascii="Times New Roman" w:eastAsia="Times New Roman" w:hAnsi="Times New Roman" w:cs="Times New Roman"/>
+          <w:kern w:val="0"/>
+          <w:lang w:val="en-SA"/>
+          <w14:ligatures w14:val="none"/>
+        </w:rPr>
+      </w:pPr>
+      <w:r>
+        <w:rPr>
+          <w:rFonts w:ascii="Times New Roman" w:eastAsia="Times New Roman" w:hAnsi="Times New Roman" w:cs="Times New Roman"/>
+          <w:kern w:val="0"/>
+          <w:lang w:val="en-SA"/>
+          <w14:ligatures w14:val="none"/>
+        </w:rPr>
+        <w:t>This vulnerability occurs because the application does not enforce strict execution order between billing and update requests. The billing process reads the order data at one point in time, while the update request modifies the order state before the transaction is finalized. Since there is no locking or validation to ensure consistency, the system processes both requests independently.</w:t>
+      </w:r>
+    </w:p>
+    <w:p>
+      <w:pPr>
+        <w:spacing w:before="100" w:beforeAutospacing="1" w:after="100" w:afterAutospacing="1" w:line="240" w:lineRule="auto"/>
+        <w:rPr>
+          <w:rFonts w:ascii="Times New Roman" w:eastAsia="Times New Roman" w:hAnsi="Times New Roman" w:cs="Times New Roman"/>
+          <w:kern w:val="0"/>
+          <w:lang w:val="en-SA"/>
+          <w14:ligatures w14:val="none"/>
+        </w:rPr>
+      </w:pPr>
+      <w:r>
+        <w:rPr>
+          <w:rFonts w:ascii="Times New Roman" w:eastAsia="Times New Roman" w:hAnsi="Times New Roman" w:cs="Times New Roman"/>
+          <w:kern w:val="0"/>
+          <w:lang w:val="en-SA"/>
+          <w14:ligatures w14:val="none"/>
+        </w:rPr>
+        <w:t>As a result, the billing operation uses stale data (lower quantity), while the updated order reflects a higher quantity. This creates a Time-of-Check to Time-of-Use (TOCTOU) vulnerability, where the system checks one version of the data but uses another.</w:t>
+      </w:r>
+    </w:p>
+    <w:p>
+      <w:pPr>
+        <w:spacing w:after="0" w:line="240" w:lineRule="auto"/>
+        <w:rPr>
+          <w:rFonts w:ascii="Times New Roman" w:eastAsia="Times New Roman" w:hAnsi="Times New Roman" w:cs="Times New Roman"/>
+          <w:kern w:val="0"/>
+          <w:lang w:val="en-SA"/>
+          <w14:ligatures w14:val="none"/>
+        </w:rPr>
+      </w:pPr>
+      <w:r>
+        <w:rPr>
+          <w:rFonts w:ascii="Times New Roman" w:eastAsia="Times New Roman" w:hAnsi="Times New Roman" w:cs="Times New Roman"/>
+          <w:noProof/>
+          <w:kern w:val="0"/>
+          <w:lang w:val="en-SA"/>
+        </w:rPr>
+        <w:pict w14:anchorId="7FC843F8">
+          <v:rect id="_x0000_i1039" alt="" style="width:468pt;height:.05pt;mso-width-percent:0;mso-height-percent:0;mso-width-percent:0;mso-height-percent:0" o:hralign="center" o:hrstd="t" o:hr="t" fillcolor="#a0a0a0" stroked="f"/>
+        </w:pict>
+      </w:r>
+    </w:p>
+    <w:p>
+      <w:pPr>
+        <w:spacing w:before="100" w:beforeAutospacing="1" w:after="100" w:afterAutospacing="1" w:line="240" w:lineRule="auto"/>
+        <w:jc w:val="center"/>
+        <w:outlineLvl w:val="1"/>
+        <w:rPr>
+          <w:rFonts w:ascii="Times New Roman" w:eastAsia="Times New Roman" w:hAnsi="Times New Roman" w:cs="Times New Roman"/>
+          <w:b/>
+          <w:bCs/>
+          <w:i/>
+          <w:iCs/>
+          <w:kern w:val="0"/>
+          <w:sz w:val="36"/>
+          <w:szCs w:val="36"/>
+          <w:lang w:val="en-SA"/>
+          <w14:ligatures w14:val="none"/>
+        </w:rPr>
+      </w:pPr>
+      <w:r>
+        <w:rPr>
+          <w:rFonts w:ascii="Times New Roman" w:eastAsia="Times New Roman" w:hAnsi="Times New Roman" w:cs="Times New Roman"/>
+          <w:b/>
+          <w:bCs/>
+          <w:i/>
+          <w:iCs/>
+          <w:kern w:val="0"/>
+          <w:sz w:val="36"/>
+          <w:szCs w:val="36"/>
+          <w:lang w:val="en-SA"/>
+          <w14:ligatures w14:val="none"/>
+        </w:rPr>
+        <w:t>Environment and Setup</w:t>
+      </w:r>
+    </w:p>
+    <w:p>
+      <w:pPr>
+        <w:spacing w:before="100" w:beforeAutospacing="1" w:after="100" w:afterAutospacing="1" w:line="240" w:lineRule="auto"/>
+        <w:rPr>
+          <w:rFonts w:ascii="Times New Roman" w:eastAsia="Times New Roman" w:hAnsi="Times New Roman" w:cs="Times New Roman"/>
+          <w:kern w:val="0"/>
+          <w:lang w:val="en-SA"/>
+          <w14:ligatures w14:val="none"/>
+        </w:rPr>
+      </w:pPr>
+      <w:r>
+        <w:rPr>
+          <w:rFonts w:ascii="Times New Roman" w:eastAsia="Times New Roman" w:hAnsi="Times New Roman" w:cs="Times New Roman"/>
+          <w:kern w:val="0"/>
+          <w:lang w:val="en-SA"/>
+          <w14:ligatures w14:val="none"/>
+        </w:rPr>
+        <w:t>The vulnerability was tested using a deployed DVSA instance running in AWS. The frontend is hosted on an S3 static website, and backend requests are handled through Amazon API Gateway, which forwards requests to Lambda functions responsible for order processing.</w:t>
+      </w:r>
+    </w:p>
+    <w:p>
+      <w:pPr>
+        <w:spacing w:before="100" w:beforeAutospacing="1" w:after="100" w:afterAutospacing="1" w:line="240" w:lineRule="auto"/>
+        <w:rPr>
+          <w:rFonts w:ascii="Times New Roman" w:eastAsia="Times New Roman" w:hAnsi="Times New Roman" w:cs="Times New Roman"/>
+          <w:kern w:val="0"/>
+          <w:lang w:val="en-SA"/>
+          <w14:ligatures w14:val="none"/>
+        </w:rPr>
+      </w:pPr>
+      <w:r>
+        <w:rPr>
+          <w:rFonts w:ascii="Times New Roman" w:eastAsia="Times New Roman" w:hAnsi="Times New Roman" w:cs="Times New Roman"/>
+          <w:kern w:val="0"/>
+          <w:lang w:val="en-SA"/>
+          <w14:ligatures w14:val="none"/>
+        </w:rPr>
+        <w:t xml:space="preserve">The primary API endpoint used was the </w:t>
+      </w:r>
+      <w:r>
+        <w:rPr>
+          <w:rFonts w:ascii="Courier New" w:eastAsia="Times New Roman" w:hAnsi="Courier New" w:cs="Courier New"/>
+          <w:kern w:val="0"/>
+          <w:sz w:val="20"/>
+          <w:szCs w:val="20"/>
+          <w:lang w:val="en-SA"/>
+          <w14:ligatures w14:val="none"/>
+        </w:rPr>
+        <w:t>/order</w:t>
+      </w:r>
+      <w:r>
+        <w:rPr>
+          <w:rFonts w:ascii="Times New Roman" w:eastAsia="Times New Roman" w:hAnsi="Times New Roman" w:cs="Times New Roman"/>
+          <w:kern w:val="0"/>
+          <w:lang w:val="en-SA"/>
+          <w14:ligatures w14:val="none"/>
+        </w:rPr>
+        <w:t xml:space="preserve"> route.</w:t>
+      </w:r>
+    </w:p>
+    <w:p>
+      <w:pPr>
+        <w:spacing w:before="100" w:beforeAutospacing="1" w:after="100" w:afterAutospacing="1" w:line="240" w:lineRule="auto"/>
+        <w:rPr>
+          <w:rFonts w:ascii="Times New Roman" w:eastAsia="Times New Roman" w:hAnsi="Times New Roman" w:cs="Times New Roman"/>
+          <w:kern w:val="0"/>
+          <w:lang w:val="en-SA"/>
+          <w14:ligatures w14:val="none"/>
+        </w:rPr>
+      </w:pPr>
+      <w:r>
+        <w:rPr>
+          <w:rFonts w:ascii="Times New Roman" w:eastAsia="Times New Roman" w:hAnsi="Times New Roman" w:cs="Times New Roman"/>
+          <w:kern w:val="0"/>
+          <w:lang w:val="en-SA"/>
+          <w14:ligatures w14:val="none"/>
+        </w:rPr>
+        <w:t>The test required a valid user account within the application. The user placed an order through the DVSA interface and used browser Developer Tools (Network tab) to capture valid API requests.</w:t>
+      </w:r>
+    </w:p>
+    <w:p>
+      <w:pPr>
+        <w:spacing w:before="100" w:beforeAutospacing="1" w:after="100" w:afterAutospacing="1" w:line="240" w:lineRule="auto"/>
+        <w:rPr>
+          <w:rFonts w:ascii="Times New Roman" w:eastAsia="Times New Roman" w:hAnsi="Times New Roman" w:cs="Times New Roman"/>
+          <w:kern w:val="0"/>
+          <w:lang w:val="en-SA"/>
+          <w14:ligatures w14:val="none"/>
+        </w:rPr>
+      </w:pPr>
+      <w:r>
+        <w:rPr>
+          <w:rFonts w:ascii="Times New Roman" w:eastAsia="Times New Roman" w:hAnsi="Times New Roman" w:cs="Times New Roman"/>
+          <w:kern w:val="0"/>
+          <w:lang w:val="en-SA"/>
+          <w14:ligatures w14:val="none"/>
+        </w:rPr>
+        <w:t>The tools used in this demonstration included:</w:t>
+      </w:r>
+    </w:p>
+    <w:p>
+      <w:pPr>
+        <w:spacing w:before="100" w:beforeAutospacing="1" w:after="100" w:afterAutospacing="1" w:line="240" w:lineRule="auto"/>
+        <w:rPr>
+          <w:rFonts w:ascii="Times New Roman" w:eastAsia="Times New Roman" w:hAnsi="Times New Roman" w:cs="Times New Roman"/>
+          <w:kern w:val="0"/>
+          <w:lang w:val="en-SA"/>
+          <w14:ligatures w14:val="none"/>
+        </w:rPr>
+      </w:pPr>
+      <w:r>
+        <w:rPr>
+          <w:rFonts w:ascii="Times New Roman" w:eastAsia="Times New Roman" w:hAnsi="Times New Roman" w:cs="Times New Roman"/>
+          <w:kern w:val="0"/>
+          <w:lang w:val="en-SA"/>
+          <w14:ligatures w14:val="none"/>
+        </w:rPr>
+        <w:t>Browser DevTools (to capture API requests)</w:t>
+      </w:r>
+      <w:r>
+        <w:rPr>
+          <w:rFonts w:ascii="Times New Roman" w:eastAsia="Times New Roman" w:hAnsi="Times New Roman" w:cs="Times New Roman"/>
+          <w:kern w:val="0"/>
+          <w:lang w:val="en-SA"/>
+          <w14:ligatures w14:val="none"/>
+        </w:rPr>
+        <w:br/>
+        <w:t>Postman (to replay and manipulate requests)</w:t>
+      </w:r>
+      <w:r>
+        <w:rPr>
+          <w:rFonts w:ascii="Times New Roman" w:eastAsia="Times New Roman" w:hAnsi="Times New Roman" w:cs="Times New Roman"/>
+          <w:kern w:val="0"/>
+          <w:lang w:val="en-SA"/>
+          <w14:ligatures w14:val="none"/>
+        </w:rPr>
+        <w:br/>
+        <w:t>AWS CloudWatch (to observe backend behavior)</w:t>
+      </w:r>
+    </w:p>
+    <w:p>
+      <w:pPr>
+        <w:spacing w:after="0" w:line="240" w:lineRule="auto"/>
+        <w:rPr>
+          <w:rFonts w:ascii="Times New Roman" w:eastAsia="Times New Roman" w:hAnsi="Times New Roman" w:cs="Times New Roman"/>
+          <w:kern w:val="0"/>
+          <w:lang w:val="en-SA"/>
+          <w14:ligatures w14:val="none"/>
+        </w:rPr>
+      </w:pPr>
+      <w:r>
+        <w:rPr>
+          <w:rFonts w:ascii="Times New Roman" w:eastAsia="Times New Roman" w:hAnsi="Times New Roman" w:cs="Times New Roman"/>
+          <w:noProof/>
+          <w:kern w:val="0"/>
+          <w:lang w:val="en-SA"/>
+        </w:rPr>
+        <w:pict w14:anchorId="40E48305">
+          <v:rect id="_x0000_i1038" alt="" style="width:468pt;height:.05pt;mso-width-percent:0;mso-height-percent:0;mso-width-percent:0;mso-height-percent:0" o:hralign="center" o:hrstd="t" o:hr="t" fillcolor="#a0a0a0" stroked="f"/>
+        </w:pict>
+      </w:r>
+    </w:p>
+    <w:p>
+      <w:pPr>
+        <w:spacing w:before="100" w:beforeAutospacing="1" w:after="100" w:afterAutospacing="1" w:line="240" w:lineRule="auto"/>
+        <w:jc w:val="center"/>
+        <w:outlineLvl w:val="1"/>
+        <w:rPr>
+          <w:rFonts w:ascii="Times New Roman" w:eastAsia="Times New Roman" w:hAnsi="Times New Roman" w:cs="Times New Roman"/>
+          <w:b/>
+          <w:bCs/>
+          <w:i/>
+          <w:iCs/>
+          <w:kern w:val="0"/>
+          <w:sz w:val="36"/>
+          <w:szCs w:val="36"/>
+          <w:lang w:val="en-SA"/>
+          <w14:ligatures w14:val="none"/>
+        </w:rPr>
+      </w:pPr>
+      <w:r>
+        <w:rPr>
+          <w:rFonts w:ascii="Times New Roman" w:eastAsia="Times New Roman" w:hAnsi="Times New Roman" w:cs="Times New Roman"/>
+          <w:b/>
+          <w:bCs/>
+          <w:i/>
+          <w:iCs/>
+          <w:kern w:val="0"/>
+          <w:sz w:val="36"/>
+          <w:szCs w:val="36"/>
+          <w:lang w:val="en-SA"/>
+          <w14:ligatures w14:val="none"/>
+        </w:rPr>
+        <w:lastRenderedPageBreak/>
+        <w:t>Reproduction Steps</w:t>
+      </w:r>
+    </w:p>
+    <w:p>
+      <w:pPr>
+        <w:spacing w:before="100" w:beforeAutospacing="1" w:after="100" w:afterAutospacing="1" w:line="240" w:lineRule="auto"/>
+        <w:rPr>
+          <w:rFonts w:ascii="Times New Roman" w:eastAsia="Times New Roman" w:hAnsi="Times New Roman" w:cs="Times New Roman"/>
+          <w:kern w:val="0"/>
+          <w:lang w:val="en-SA"/>
+          <w14:ligatures w14:val="none"/>
+        </w:rPr>
+      </w:pPr>
+      <w:r>
+        <w:rPr>
+          <w:rFonts w:ascii="Times New Roman" w:eastAsia="Times New Roman" w:hAnsi="Times New Roman" w:cs="Times New Roman"/>
+          <w:kern w:val="0"/>
+          <w:lang w:val="en-SA"/>
+          <w14:ligatures w14:val="none"/>
+        </w:rPr>
+        <w:t>The attack begins by creating an order and setting the quantity of an item to a small value (e.g., 1 item). This ensures that the billing request will calculate a lower total amount.</w:t>
+      </w:r>
+    </w:p>
+    <w:p>
+      <w:pPr>
+        <w:spacing w:before="100" w:beforeAutospacing="1" w:after="100" w:afterAutospacing="1" w:line="240" w:lineRule="auto"/>
+        <w:rPr>
+          <w:rFonts w:ascii="Times New Roman" w:eastAsia="Times New Roman" w:hAnsi="Times New Roman" w:cs="Times New Roman"/>
+          <w:kern w:val="0"/>
+          <w:lang w:val="en-SA"/>
+          <w14:ligatures w14:val="none"/>
+        </w:rPr>
+      </w:pPr>
+      <w:r>
+        <w:rPr>
+          <w:rFonts w:ascii="Times New Roman" w:eastAsia="Times New Roman" w:hAnsi="Times New Roman" w:cs="Times New Roman"/>
+          <w:kern w:val="0"/>
+          <w:lang w:val="en-SA"/>
+          <w14:ligatures w14:val="none"/>
+        </w:rPr>
+        <w:t>Next, a billing request is sent using valid payment details. Immediately after sending the billing request, an update request is issued to increase the quantity of the same item (e.g., from 1 to 3).</w:t>
+      </w:r>
+    </w:p>
+    <w:p>
+      <w:pPr>
+        <w:spacing w:before="100" w:beforeAutospacing="1" w:after="100" w:afterAutospacing="1" w:line="240" w:lineRule="auto"/>
+        <w:rPr>
+          <w:rFonts w:ascii="Times New Roman" w:eastAsia="Times New Roman" w:hAnsi="Times New Roman" w:cs="Times New Roman"/>
+          <w:kern w:val="0"/>
+          <w:lang w:val="en-SA"/>
+          <w14:ligatures w14:val="none"/>
+        </w:rPr>
+      </w:pPr>
+      <w:r>
+        <w:rPr>
+          <w:rFonts w:ascii="Times New Roman" w:eastAsia="Times New Roman" w:hAnsi="Times New Roman" w:cs="Times New Roman"/>
+          <w:kern w:val="0"/>
+          <w:lang w:val="en-SA"/>
+          <w14:ligatures w14:val="none"/>
+        </w:rPr>
+        <w:t>Both requests are sent in rapid succession to exploit the lack of synchronization in the backend.</w:t>
+      </w:r>
+    </w:p>
+    <w:p>
+      <w:pPr>
+        <w:spacing w:before="100" w:beforeAutospacing="1" w:after="100" w:afterAutospacing="1" w:line="240" w:lineRule="auto"/>
+        <w:rPr>
+          <w:rFonts w:ascii="Times New Roman" w:eastAsia="Times New Roman" w:hAnsi="Times New Roman" w:cs="Times New Roman"/>
+          <w:kern w:val="0"/>
+          <w:lang w:val="en-SA"/>
+          <w14:ligatures w14:val="none"/>
+        </w:rPr>
+      </w:pPr>
+      <w:r>
+        <w:rPr>
+          <w:rFonts w:ascii="Times New Roman" w:eastAsia="Times New Roman" w:hAnsi="Times New Roman" w:cs="Times New Roman"/>
+          <w:kern w:val="0"/>
+          <w:lang w:val="en-SA"/>
+          <w14:ligatures w14:val="none"/>
+        </w:rPr>
+        <w:t>Because the system does not enforce ordering or consistency checks, the billing request processes the original quantity, while the update request modifies the order before finalization.</w:t>
+      </w:r>
+    </w:p>
+    <w:p>
+      <w:pPr>
+        <w:spacing w:after="0" w:line="240" w:lineRule="auto"/>
+        <w:rPr>
+          <w:rFonts w:ascii="Times New Roman" w:eastAsia="Times New Roman" w:hAnsi="Times New Roman" w:cs="Times New Roman"/>
+          <w:kern w:val="0"/>
+          <w:lang w:val="en-SA"/>
+          <w14:ligatures w14:val="none"/>
+        </w:rPr>
+      </w:pPr>
+      <w:r>
+        <w:rPr>
+          <w:rFonts w:ascii="Times New Roman" w:eastAsia="Times New Roman" w:hAnsi="Times New Roman" w:cs="Times New Roman"/>
+          <w:noProof/>
+          <w:kern w:val="0"/>
+          <w:lang w:val="en-SA"/>
+        </w:rPr>
+        <w:pict w14:anchorId="19832F4F">
+          <v:rect id="_x0000_i1037" alt="" style="width:468pt;height:.05pt;mso-width-percent:0;mso-height-percent:0;mso-width-percent:0;mso-height-percent:0" o:hralign="center" o:hrstd="t" o:hr="t" fillcolor="#a0a0a0" stroked="f"/>
+        </w:pict>
+      </w:r>
+    </w:p>
+    <w:p>
+      <w:pPr>
+        <w:spacing w:before="100" w:beforeAutospacing="1" w:after="100" w:afterAutospacing="1" w:line="240" w:lineRule="auto"/>
+        <w:outlineLvl w:val="2"/>
+        <w:rPr>
+          <w:rFonts w:ascii="Times New Roman" w:eastAsia="Times New Roman" w:hAnsi="Times New Roman" w:cs="Times New Roman"/>
+          <w:b/>
+          <w:bCs/>
+          <w:kern w:val="0"/>
+          <w:sz w:val="27"/>
+          <w:szCs w:val="27"/>
+          <w:lang w:val="en-SA"/>
+          <w14:ligatures w14:val="none"/>
+        </w:rPr>
+      </w:pPr>
+      <w:r>
+        <w:rPr>
+          <w:rFonts w:ascii="Times New Roman" w:eastAsia="Times New Roman" w:hAnsi="Times New Roman" w:cs="Times New Roman"/>
+          <w:b/>
+          <w:bCs/>
+          <w:kern w:val="0"/>
+          <w:sz w:val="27"/>
+          <w:szCs w:val="27"/>
+          <w:lang w:val="en-SA"/>
+          <w14:ligatures w14:val="none"/>
+        </w:rPr>
+        <w:t xml:space="preserve"> </w:t>
+      </w:r>
+      <w:r>
+        <w:rPr>
+          <w:rFonts w:ascii="Times New Roman" w:eastAsia="Times New Roman" w:hAnsi="Times New Roman" w:cs="Times New Roman"/>
+          <w:b/>
+          <w:bCs/>
+          <w:kern w:val="0"/>
+          <w:sz w:val="27"/>
+          <w:szCs w:val="27"/>
+          <w:lang w:val="en-SA"/>
+          <w14:ligatures w14:val="none"/>
+        </w:rPr>
+        <w:drawing>
+          <wp:inline distT="0" distB="0" distL="0" distR="0" wp14:anchorId="3EE1B3A4" wp14:editId="626C3972">
+            <wp:extent cx="5943600" cy="3987800"/>
+            <wp:effectExtent l="0" t="0" r="0" b="0"/>
+            <wp:docPr id="1740355890" name="Picture 1" descr="A screenshot of a computer&#10;&#10;AI-generated content may be incorrect."/>
+            <wp:cNvGraphicFramePr>
+              <a:graphicFrameLocks xmlns:a="http://schemas.openxmlformats.org/drawingml/2006/main" noChangeAspect="1"/>
+            </wp:cNvGraphicFramePr>
+            <a:graphic xmlns:a="http://schemas.openxmlformats.org/drawingml/2006/main">
+              <a:graphicData uri="http://schemas.openxmlformats.org/drawingml/2006/picture">
+                <pic:pic xmlns:pic="http://schemas.openxmlformats.org/drawingml/2006/picture">
+                  <pic:nvPicPr>
+                    <pic:cNvPr id="1740355890" name="Picture 1" descr="A screenshot of a computer&#10;&#10;AI-generated content may be incorrect."/>
+                    <pic:cNvPicPr/>
+                  </pic:nvPicPr>
+                  <pic:blipFill>
+                    <a:blip r:embed="rId7"/>
+                    <a:stretch>
+                      <a:fillRect/>
+                    </a:stretch>
+                  </pic:blipFill>
+                  <pic:spPr>
+                    <a:xfrm>
+                      <a:off x="0" y="0"/>
+                      <a:ext cx="5943600" cy="3987800"/>
+                    </a:xfrm>
+                    <a:prstGeom prst="rect">
+                      <a:avLst/>
+                    </a:prstGeom>
+                  </pic:spPr>
+                </pic:pic>
+              </a:graphicData>
+            </a:graphic>
+          </wp:inline>
+        </w:drawing>
+      </w:r>
+    </w:p>
+    <w:p>
+      <w:pPr>
+        <w:spacing w:before="100" w:beforeAutospacing="1" w:after="100" w:afterAutospacing="1" w:line="240" w:lineRule="auto"/>
+        <w:outlineLvl w:val="2"/>
+        <w:rPr>
+          <w:rFonts w:ascii="Times New Roman" w:eastAsia="Times New Roman" w:hAnsi="Times New Roman" w:cs="Times New Roman"/>
+          <w:b/>
+          <w:bCs/>
+          <w:kern w:val="0"/>
+          <w:sz w:val="27"/>
+          <w:szCs w:val="27"/>
+          <w:lang w:val="en-SA"/>
+          <w14:ligatures w14:val="none"/>
+        </w:rPr>
+      </w:pPr>
+    </w:p>
+    <w:p>
+      <w:pPr>
+        <w:spacing w:before="100" w:beforeAutospacing="1" w:after="100" w:afterAutospacing="1" w:line="240" w:lineRule="auto"/>
+        <w:outlineLvl w:val="2"/>
+        <w:rPr>
+          <w:rFonts w:ascii="Times New Roman" w:eastAsia="Times New Roman" w:hAnsi="Times New Roman" w:cs="Times New Roman"/>
+          <w:b/>
+          <w:bCs/>
+          <w:kern w:val="0"/>
+          <w:sz w:val="27"/>
+          <w:szCs w:val="27"/>
+          <w:lang w:val="en-SA"/>
+          <w14:ligatures w14:val="none"/>
+        </w:rPr>
+      </w:pPr>
+    </w:p>
+    <w:p>
+      <w:pPr>
+        <w:spacing w:before="100" w:beforeAutospacing="1" w:after="100" w:afterAutospacing="1" w:line="240" w:lineRule="auto"/>
+        <w:outlineLvl w:val="2"/>
+        <w:rPr>
+          <w:rFonts w:ascii="Times New Roman" w:eastAsia="Times New Roman" w:hAnsi="Times New Roman" w:cs="Times New Roman"/>
+          <w:b/>
+          <w:bCs/>
+          <w:kern w:val="0"/>
+          <w:sz w:val="27"/>
+          <w:szCs w:val="27"/>
+          <w:lang w:val="en-SA"/>
+          <w14:ligatures w14:val="none"/>
+        </w:rPr>
+      </w:pPr>
+    </w:p>
+    <w:p>
+      <w:pPr>
+        <w:spacing w:after="0" w:line="240" w:lineRule="auto"/>
+        <w:rPr>
+          <w:rFonts w:ascii="Times New Roman" w:eastAsia="Times New Roman" w:hAnsi="Times New Roman" w:cs="Times New Roman"/>
+          <w:kern w:val="0"/>
+          <w:lang w:val="en-SA"/>
+          <w14:ligatures w14:val="none"/>
+        </w:rPr>
+      </w:pPr>
+      <w:r>
+        <w:rPr>
+          <w:rFonts w:ascii="Times New Roman" w:eastAsia="Times New Roman" w:hAnsi="Times New Roman" w:cs="Times New Roman"/>
+          <w:noProof/>
+          <w:kern w:val="0"/>
+          <w:lang w:val="en-SA"/>
+        </w:rPr>
+        <w:lastRenderedPageBreak/>
+        <w:pict w14:anchorId="58BAB108">
+          <v:rect id="_x0000_i1036" alt="" style="width:468pt;height:.05pt;mso-width-percent:0;mso-height-percent:0;mso-width-percent:0;mso-height-percent:0" o:hralign="center" o:hrstd="t" o:hr="t" fillcolor="#a0a0a0" stroked="f"/>
+        </w:pict>
+      </w:r>
+    </w:p>
+    <w:p>
+      <w:pPr>
+        <w:spacing w:before="100" w:beforeAutospacing="1" w:after="100" w:afterAutospacing="1" w:line="240" w:lineRule="auto"/>
+        <w:jc w:val="center"/>
+        <w:outlineLvl w:val="1"/>
+        <w:rPr>
+          <w:rFonts w:ascii="Times New Roman" w:eastAsia="Times New Roman" w:hAnsi="Times New Roman" w:cs="Times New Roman"/>
+          <w:b/>
+          <w:bCs/>
+          <w:i/>
+          <w:iCs/>
+          <w:kern w:val="0"/>
+          <w:sz w:val="36"/>
+          <w:szCs w:val="36"/>
+          <w:lang w:val="en-SA"/>
+          <w14:ligatures w14:val="none"/>
+        </w:rPr>
+      </w:pPr>
+      <w:r>
+        <w:rPr>
+          <w:rFonts w:ascii="Times New Roman" w:eastAsia="Times New Roman" w:hAnsi="Times New Roman" w:cs="Times New Roman"/>
+          <w:b/>
+          <w:bCs/>
+          <w:i/>
+          <w:iCs/>
+          <w:kern w:val="0"/>
+          <w:sz w:val="36"/>
+          <w:szCs w:val="36"/>
+          <w:lang w:val="en-SA"/>
+          <w14:ligatures w14:val="none"/>
+        </w:rPr>
+        <w:t>Evidence and Proof</w:t>
+      </w:r>
+    </w:p>
+    <w:p>
+      <w:pPr>
+        <w:spacing w:before="100" w:beforeAutospacing="1" w:after="100" w:afterAutospacing="1" w:line="240" w:lineRule="auto"/>
+        <w:rPr>
+          <w:rFonts w:ascii="Times New Roman" w:eastAsia="Times New Roman" w:hAnsi="Times New Roman" w:cs="Times New Roman"/>
+          <w:kern w:val="0"/>
+          <w:lang w:val="en-SA"/>
+          <w14:ligatures w14:val="none"/>
+        </w:rPr>
+      </w:pPr>
+      <w:r>
+        <w:rPr>
+          <w:rFonts w:ascii="Times New Roman" w:eastAsia="Times New Roman" w:hAnsi="Times New Roman" w:cs="Times New Roman"/>
+          <w:kern w:val="0"/>
+          <w:lang w:val="en-SA"/>
+          <w14:ligatures w14:val="none"/>
+        </w:rPr>
+        <w:t>The vulnerability is confirmed by the mismatch between the billed amount and the final order contents.</w:t>
+      </w:r>
+    </w:p>
+    <w:p>
+      <w:pPr>
+        <w:spacing w:before="100" w:beforeAutospacing="1" w:after="100" w:afterAutospacing="1" w:line="240" w:lineRule="auto"/>
+        <w:rPr>
+          <w:rFonts w:ascii="Times New Roman" w:eastAsia="Times New Roman" w:hAnsi="Times New Roman" w:cs="Times New Roman"/>
+          <w:kern w:val="0"/>
+          <w:lang w:val="en-SA"/>
+          <w14:ligatures w14:val="none"/>
+        </w:rPr>
+      </w:pPr>
+      <w:r>
+        <w:rPr>
+          <w:rFonts w:ascii="Times New Roman" w:eastAsia="Times New Roman" w:hAnsi="Times New Roman" w:cs="Times New Roman"/>
+          <w:kern w:val="0"/>
+          <w:lang w:val="en-SA"/>
+          <w14:ligatures w14:val="none"/>
+        </w:rPr>
+        <w:t>The billing response indicated a successful transaction with an amount of $33, which corresponds to a single item. However, the final receipt displayed a quantity of three items while the total price remained $33.</w:t>
+      </w:r>
+    </w:p>
+    <w:p>
+      <w:pPr>
+        <w:spacing w:before="100" w:beforeAutospacing="1" w:after="100" w:afterAutospacing="1" w:line="240" w:lineRule="auto"/>
+        <w:rPr>
+          <w:rFonts w:ascii="Times New Roman" w:eastAsia="Times New Roman" w:hAnsi="Times New Roman" w:cs="Times New Roman"/>
+          <w:kern w:val="0"/>
+          <w:lang w:val="en-SA"/>
+          <w14:ligatures w14:val="none"/>
+        </w:rPr>
+      </w:pPr>
+      <w:r>
+        <w:rPr>
+          <w:rFonts w:ascii="Times New Roman" w:eastAsia="Times New Roman" w:hAnsi="Times New Roman" w:cs="Times New Roman"/>
+          <w:kern w:val="0"/>
+          <w:lang w:val="en-SA"/>
+          <w14:ligatures w14:val="none"/>
+        </w:rPr>
+        <w:t>This proves that the system charged based on outdated order data while storing the updated order state.</w:t>
+      </w:r>
+    </w:p>
+    <w:p>
+      <w:pPr>
+        <w:spacing w:after="0" w:line="240" w:lineRule="auto"/>
+        <w:rPr>
+          <w:rFonts w:ascii="Times New Roman" w:eastAsia="Times New Roman" w:hAnsi="Times New Roman" w:cs="Times New Roman"/>
+          <w:kern w:val="0"/>
+          <w:lang w:val="en-SA"/>
+          <w14:ligatures w14:val="none"/>
+        </w:rPr>
+      </w:pPr>
+      <w:r>
+        <w:rPr>
+          <w:rFonts w:ascii="Times New Roman" w:eastAsia="Times New Roman" w:hAnsi="Times New Roman" w:cs="Times New Roman"/>
+          <w:noProof/>
+          <w:kern w:val="0"/>
+          <w:lang w:val="en-SA"/>
+        </w:rPr>
+        <w:pict w14:anchorId="0D2656C0">
+          <v:rect id="_x0000_i1035" alt="" style="width:468pt;height:.05pt;mso-width-percent:0;mso-height-percent:0;mso-width-percent:0;mso-height-percent:0" o:hralign="center" o:hrstd="t" o:hr="t" fillcolor="#a0a0a0" stroked="f"/>
+        </w:pict>
+      </w:r>
+    </w:p>
+    <w:p>
+      <w:pPr>
+        <w:spacing w:after="0" w:line="240" w:lineRule="auto"/>
+        <w:rPr>
+          <w:rFonts w:ascii="Times New Roman" w:eastAsia="Times New Roman" w:hAnsi="Times New Roman" w:cs="Times New Roman"/>
+          <w:kern w:val="0"/>
+          <w:lang w:val="en-SA"/>
+          <w14:ligatures w14:val="none"/>
+        </w:rPr>
+      </w:pPr>
+      <w:r>
+        <w:rPr>
+          <w:rFonts w:ascii="Times New Roman" w:eastAsia="Times New Roman" w:hAnsi="Times New Roman" w:cs="Times New Roman"/>
+          <w:b/>
+          <w:bCs/>
+          <w:kern w:val="0"/>
+          <w:sz w:val="27"/>
+          <w:szCs w:val="27"/>
+          <w:lang w:val="en-SA"/>
+          <w14:ligatures w14:val="none"/>
+        </w:rPr>
+        <w:drawing>
+          <wp:inline distT="0" distB="0" distL="0" distR="0" wp14:anchorId="7DBB5A83" wp14:editId="7F998BEB">
+            <wp:extent cx="3835400" cy="1333500"/>
+            <wp:effectExtent l="0" t="0" r="0" b="0"/>
+            <wp:docPr id="132866940" name="Picture 1" descr="A screenshot of a computer program&#10;&#10;AI-generated content may be incorrect."/>
+            <wp:cNvGraphicFramePr>
+              <a:graphicFrameLocks xmlns:a="http://schemas.openxmlformats.org/drawingml/2006/main" noChangeAspect="1"/>
+            </wp:cNvGraphicFramePr>
+            <a:graphic xmlns:a="http://schemas.openxmlformats.org/drawingml/2006/main">
+              <a:graphicData uri="http://schemas.openxmlformats.org/drawingml/2006/picture">
+                <pic:pic xmlns:pic="http://schemas.openxmlformats.org/drawingml/2006/picture">
+                  <pic:nvPicPr>
+                    <pic:cNvPr id="132866940" name="Picture 1" descr="A screenshot of a computer program&#10;&#10;AI-generated content may be incorrect."/>
+                    <pic:cNvPicPr/>
+                  </pic:nvPicPr>
+                  <pic:blipFill>
+                    <a:blip r:embed="rId8"/>
+                    <a:stretch>
+                      <a:fillRect/>
+                    </a:stretch>
+                  </pic:blipFill>
+                  <pic:spPr>
+                    <a:xfrm>
+                      <a:off x="0" y="0"/>
+                      <a:ext cx="3835400" cy="1333500"/>
+                    </a:xfrm>
+                    <a:prstGeom prst="rect">
+                      <a:avLst/>
+                    </a:prstGeom>
+                  </pic:spPr>
+                </pic:pic>
+              </a:graphicData>
+            </a:graphic>
+          </wp:inline>
+        </w:drawing>
+      </w:r>
+      <w:r>
+        <w:rPr>
+          <w:rFonts w:ascii="Times New Roman" w:eastAsia="Times New Roman" w:hAnsi="Times New Roman" w:cs="Times New Roman"/>
+          <w:b/>
+          <w:bCs/>
+          <w:kern w:val="0"/>
+          <w:sz w:val="27"/>
+          <w:szCs w:val="27"/>
+          <w:lang w:val="en-SA"/>
+          <w14:ligatures w14:val="none"/>
+        </w:rPr>
+        <w:drawing>
+          <wp:inline distT="0" distB="0" distL="0" distR="0" wp14:anchorId="660EC1E0" wp14:editId="2D978DE3">
+            <wp:extent cx="5943600" cy="3886200"/>
+            <wp:effectExtent l="0" t="0" r="0" b="0"/>
+            <wp:docPr id="1594509347" name="Picture 1" descr="A screenshot of a computer&#10;&#10;AI-generated content may be incorrect."/>
+            <wp:cNvGraphicFramePr>
+              <a:graphicFrameLocks xmlns:a="http://schemas.openxmlformats.org/drawingml/2006/main" noChangeAspect="1"/>
+            </wp:cNvGraphicFramePr>
+            <a:graphic xmlns:a="http://schemas.openxmlformats.org/drawingml/2006/main">
+              <a:graphicData uri="http://schemas.openxmlformats.org/drawingml/2006/picture">
+                <pic:pic xmlns:pic="http://schemas.openxmlformats.org/drawingml/2006/picture">
+                  <pic:nvPicPr>
+                    <pic:cNvPr id="1594509347" name="Picture 1" descr="A screenshot of a computer&#10;&#10;AI-generated content may be incorrect."/>
+                    <pic:cNvPicPr/>
+                  </pic:nvPicPr>
+                  <pic:blipFill>
+                    <a:blip r:embed="rId9"/>
+                    <a:stretch>
+                      <a:fillRect/>
+                    </a:stretch>
+                  </pic:blipFill>
+                  <pic:spPr>
+                    <a:xfrm>
+                      <a:off x="0" y="0"/>
+                      <a:ext cx="5943600" cy="3886200"/>
+                    </a:xfrm>
+                    <a:prstGeom prst="rect">
+                      <a:avLst/>
+                    </a:prstGeom>
+                  </pic:spPr>
+                </pic:pic>
+              </a:graphicData>
+            </a:graphic>
+          </wp:inline>
+        </w:drawing>
+      </w:r>
+      <w:r>
+        <w:rPr>
+          <w:rFonts w:ascii="Times New Roman" w:eastAsia="Times New Roman" w:hAnsi="Times New Roman" w:cs="Times New Roman"/>
+          <w:noProof/>
+          <w:kern w:val="0"/>
+          <w:lang w:val="en-SA"/>
+        </w:rPr>
+        <w:pict w14:anchorId="12DACB3C">
+          <v:rect id="_x0000_i1034" alt="" style="width:468pt;height:.05pt;mso-width-percent:0;mso-height-percent:0;mso-width-percent:0;mso-height-percent:0" o:hralign="center" o:hrstd="t" o:hr="t" fillcolor="#a0a0a0" stroked="f"/>
+        </w:pict>
+      </w:r>
+    </w:p>
+    <w:p>
+      <w:pPr>
+        <w:spacing w:before="100" w:beforeAutospacing="1" w:after="100" w:afterAutospacing="1" w:line="240" w:lineRule="auto"/>
+        <w:jc w:val="center"/>
+        <w:outlineLvl w:val="1"/>
+        <w:rPr>
+          <w:rFonts w:ascii="Times New Roman" w:eastAsia="Times New Roman" w:hAnsi="Times New Roman" w:cs="Times New Roman"/>
+          <w:b/>
+          <w:bCs/>
+          <w:i/>
+          <w:iCs/>
+          <w:kern w:val="0"/>
+          <w:sz w:val="36"/>
+          <w:szCs w:val="36"/>
+          <w:lang w:val="en-SA"/>
+          <w14:ligatures w14:val="none"/>
+        </w:rPr>
+      </w:pPr>
+      <w:r>
+        <w:rPr>
+          <w:rFonts w:ascii="Times New Roman" w:eastAsia="Times New Roman" w:hAnsi="Times New Roman" w:cs="Times New Roman"/>
+          <w:b/>
+          <w:bCs/>
+          <w:i/>
+          <w:iCs/>
+          <w:kern w:val="0"/>
+          <w:sz w:val="36"/>
+          <w:szCs w:val="36"/>
+          <w:lang w:val="en-SA"/>
+          <w14:ligatures w14:val="none"/>
+        </w:rPr>
+        <w:lastRenderedPageBreak/>
+        <w:t>Fix Strategy / Probable Mitigation</w:t>
+      </w:r>
+    </w:p>
+    <w:p>
+      <w:pPr>
+        <w:spacing w:before="100" w:beforeAutospacing="1" w:after="100" w:afterAutospacing="1" w:line="240" w:lineRule="auto"/>
+        <w:rPr>
+          <w:rFonts w:ascii="Times New Roman" w:eastAsia="Times New Roman" w:hAnsi="Times New Roman" w:cs="Times New Roman"/>
+          <w:kern w:val="0"/>
+          <w:lang w:val="en-SA"/>
+          <w14:ligatures w14:val="none"/>
+        </w:rPr>
+      </w:pPr>
+      <w:r>
+        <w:rPr>
+          <w:rFonts w:ascii="Times New Roman" w:eastAsia="Times New Roman" w:hAnsi="Times New Roman" w:cs="Times New Roman"/>
+          <w:kern w:val="0"/>
+          <w:lang w:val="en-SA"/>
+          <w14:ligatures w14:val="none"/>
+        </w:rPr>
+        <w:t>The appropriate fix for this vulnerability is to enforce proper synchronization between billing and update operations.</w:t>
+      </w:r>
+    </w:p>
+    <w:p>
+      <w:pPr>
+        <w:spacing w:before="100" w:beforeAutospacing="1" w:after="100" w:afterAutospacing="1" w:line="240" w:lineRule="auto"/>
+        <w:rPr>
+          <w:rFonts w:ascii="Times New Roman" w:eastAsia="Times New Roman" w:hAnsi="Times New Roman" w:cs="Times New Roman"/>
+          <w:kern w:val="0"/>
+          <w:lang w:val="en-SA"/>
+          <w14:ligatures w14:val="none"/>
+        </w:rPr>
+      </w:pPr>
+      <w:r>
+        <w:rPr>
+          <w:rFonts w:ascii="Times New Roman" w:eastAsia="Times New Roman" w:hAnsi="Times New Roman" w:cs="Times New Roman"/>
+          <w:kern w:val="0"/>
+          <w:lang w:val="en-SA"/>
+          <w14:ligatures w14:val="none"/>
+        </w:rPr>
+        <w:t>The application should ensure that once the billing process begins, the order cannot be modified until the transaction is completed. This can be achieved by introducing an order status such as “processing” and rejecting any update requests during this state.</w:t>
+      </w:r>
+    </w:p>
+    <w:p>
+      <w:pPr>
+        <w:spacing w:before="100" w:beforeAutospacing="1" w:after="100" w:afterAutospacing="1" w:line="240" w:lineRule="auto"/>
+        <w:rPr>
+          <w:rFonts w:ascii="Times New Roman" w:eastAsia="Times New Roman" w:hAnsi="Times New Roman" w:cs="Times New Roman"/>
+          <w:kern w:val="0"/>
+          <w:lang w:val="en-SA"/>
+          <w14:ligatures w14:val="none"/>
+        </w:rPr>
+      </w:pPr>
+      <w:r>
+        <w:rPr>
+          <w:rFonts w:ascii="Times New Roman" w:eastAsia="Times New Roman" w:hAnsi="Times New Roman" w:cs="Times New Roman"/>
+          <w:kern w:val="0"/>
+          <w:lang w:val="en-SA"/>
+          <w14:ligatures w14:val="none"/>
+        </w:rPr>
+        <w:t>Additionally, the system should re-validate the order contents immediately before completing the billing operation to ensure consistency. Using transactional or atomic operations can further guarantee that billing and order updates are processed as a single consistent unit.</w:t>
+      </w:r>
+    </w:p>
+    <w:p>
+      <w:pPr>
+        <w:spacing w:after="0" w:line="240" w:lineRule="auto"/>
+        <w:rPr>
+          <w:rFonts w:ascii="Times New Roman" w:eastAsia="Times New Roman" w:hAnsi="Times New Roman" w:cs="Times New Roman"/>
+          <w:kern w:val="0"/>
+          <w:lang w:val="en-SA"/>
+          <w14:ligatures w14:val="none"/>
+        </w:rPr>
+      </w:pPr>
+      <w:r>
+        <w:rPr>
+          <w:rFonts w:ascii="Times New Roman" w:eastAsia="Times New Roman" w:hAnsi="Times New Roman" w:cs="Times New Roman"/>
+          <w:noProof/>
+          <w:kern w:val="0"/>
+          <w:lang w:val="en-SA"/>
+        </w:rPr>
+        <w:pict w14:anchorId="6EB37B36">
+          <v:rect id="_x0000_i1033" alt="" style="width:468pt;height:.05pt;mso-width-percent:0;mso-height-percent:0;mso-width-percent:0;mso-height-percent:0" o:hralign="center" o:hrstd="t" o:hr="t" fillcolor="#a0a0a0" stroked="f"/>
+        </w:pict>
+      </w:r>
+    </w:p>
+    <w:p>
+      <w:pPr>
+        <w:spacing w:before="100" w:beforeAutospacing="1" w:after="100" w:afterAutospacing="1" w:line="240" w:lineRule="auto"/>
+        <w:jc w:val="center"/>
+        <w:outlineLvl w:val="1"/>
+        <w:rPr>
+          <w:rFonts w:ascii="Times New Roman" w:eastAsia="Times New Roman" w:hAnsi="Times New Roman" w:cs="Times New Roman"/>
+          <w:b/>
+          <w:bCs/>
+          <w:i/>
+          <w:iCs/>
+          <w:kern w:val="0"/>
+          <w:sz w:val="36"/>
+          <w:szCs w:val="36"/>
+          <w:lang w:val="en-SA"/>
+          <w14:ligatures w14:val="none"/>
+        </w:rPr>
+      </w:pPr>
+      <w:r>
+        <w:rPr>
+          <w:rFonts w:ascii="Times New Roman" w:eastAsia="Times New Roman" w:hAnsi="Times New Roman" w:cs="Times New Roman"/>
+          <w:b/>
+          <w:bCs/>
+          <w:i/>
+          <w:iCs/>
+          <w:kern w:val="0"/>
+          <w:sz w:val="36"/>
+          <w:szCs w:val="36"/>
+          <w:lang w:val="en-SA"/>
+          <w14:ligatures w14:val="none"/>
+        </w:rPr>
+        <w:t>Code / Config Changes</w:t>
+      </w:r>
+    </w:p>
+    <w:p>
+      <w:pPr>
+        <w:spacing w:before="100" w:beforeAutospacing="1" w:after="100" w:afterAutospacing="1" w:line="240" w:lineRule="auto"/>
+        <w:rPr>
+          <w:rFonts w:ascii="Times New Roman" w:eastAsia="Times New Roman" w:hAnsi="Times New Roman" w:cs="Times New Roman"/>
+          <w:kern w:val="0"/>
+          <w:lang w:val="en-SA"/>
+          <w14:ligatures w14:val="none"/>
+        </w:rPr>
+      </w:pPr>
+      <w:r>
+        <w:rPr>
+          <w:rFonts w:ascii="Times New Roman" w:eastAsia="Times New Roman" w:hAnsi="Times New Roman" w:cs="Times New Roman"/>
+          <w:kern w:val="0"/>
+          <w:lang w:val="en-SA"/>
+          <w14:ligatures w14:val="none"/>
+        </w:rPr>
+        <w:t>To fix the vulnerability, the order processing logic in the backend Lambda functions should be updated to enforce strict state validation.</w:t>
+      </w:r>
+    </w:p>
+    <w:p>
+      <w:pPr>
+        <w:spacing w:before="100" w:beforeAutospacing="1" w:after="100" w:afterAutospacing="1" w:line="240" w:lineRule="auto"/>
+        <w:rPr>
+          <w:rFonts w:ascii="Times New Roman" w:eastAsia="Times New Roman" w:hAnsi="Times New Roman" w:cs="Times New Roman"/>
+          <w:kern w:val="0"/>
+          <w:lang w:val="en-SA"/>
+          <w14:ligatures w14:val="none"/>
+        </w:rPr>
+      </w:pPr>
+      <w:r>
+        <w:rPr>
+          <w:rFonts w:ascii="Times New Roman" w:eastAsia="Times New Roman" w:hAnsi="Times New Roman" w:cs="Times New Roman"/>
+          <w:kern w:val="0"/>
+          <w:lang w:val="en-SA"/>
+          <w14:ligatures w14:val="none"/>
+        </w:rPr>
+        <w:t>Before the fix, the system allowed update requests to modify the order even while billing was being processed. After the fix, the logic ensures that update requests are rejected if the order is in a billing or completed state.</w:t>
+      </w:r>
+    </w:p>
+    <w:p>
+      <w:pPr>
+        <w:spacing w:before="100" w:beforeAutospacing="1" w:after="100" w:afterAutospacing="1" w:line="240" w:lineRule="auto"/>
+        <w:rPr>
+          <w:rFonts w:ascii="Times New Roman" w:eastAsia="Times New Roman" w:hAnsi="Times New Roman" w:cs="Times New Roman"/>
+          <w:kern w:val="0"/>
+          <w:lang w:val="en-SA"/>
+          <w14:ligatures w14:val="none"/>
+        </w:rPr>
+      </w:pPr>
+      <w:r>
+        <w:rPr>
+          <w:rFonts w:ascii="Times New Roman" w:eastAsia="Times New Roman" w:hAnsi="Times New Roman" w:cs="Times New Roman"/>
+          <w:kern w:val="0"/>
+          <w:lang w:val="en-SA"/>
+          <w14:ligatures w14:val="none"/>
+        </w:rPr>
+        <w:t>The main logic change includes:</w:t>
+      </w:r>
+    </w:p>
+    <w:p>
+      <w:pPr>
+        <w:spacing w:before="100" w:beforeAutospacing="1" w:after="100" w:afterAutospacing="1" w:line="240" w:lineRule="auto"/>
+        <w:rPr>
+          <w:rFonts w:ascii="Times New Roman" w:eastAsia="Times New Roman" w:hAnsi="Times New Roman" w:cs="Times New Roman"/>
+          <w:kern w:val="0"/>
+          <w:lang w:val="en-SA"/>
+          <w14:ligatures w14:val="none"/>
+        </w:rPr>
+      </w:pPr>
+      <w:r>
+        <w:rPr>
+          <w:rFonts w:ascii="Times New Roman" w:eastAsia="Times New Roman" w:hAnsi="Times New Roman" w:cs="Times New Roman"/>
+          <w:kern w:val="0"/>
+          <w:lang w:val="en-SA"/>
+          <w14:ligatures w14:val="none"/>
+        </w:rPr>
+        <w:t>Adding an order status field (e.g., “processing”)</w:t>
+      </w:r>
+      <w:r>
+        <w:rPr>
+          <w:rFonts w:ascii="Times New Roman" w:eastAsia="Times New Roman" w:hAnsi="Times New Roman" w:cs="Times New Roman"/>
+          <w:kern w:val="0"/>
+          <w:lang w:val="en-SA"/>
+          <w14:ligatures w14:val="none"/>
+        </w:rPr>
+        <w:br/>
+        <w:t>Blocking updates during billing</w:t>
+      </w:r>
+      <w:r>
+        <w:rPr>
+          <w:rFonts w:ascii="Times New Roman" w:eastAsia="Times New Roman" w:hAnsi="Times New Roman" w:cs="Times New Roman"/>
+          <w:kern w:val="0"/>
+          <w:lang w:val="en-SA"/>
+          <w14:ligatures w14:val="none"/>
+        </w:rPr>
+        <w:br/>
+        <w:t>Re-validating order data before charging</w:t>
+      </w:r>
+      <w:r>
+        <w:rPr>
+          <w:rFonts w:ascii="Times New Roman" w:eastAsia="Times New Roman" w:hAnsi="Times New Roman" w:cs="Times New Roman"/>
+          <w:b/>
+          <w:bCs/>
+          <w:kern w:val="0"/>
+          <w:sz w:val="27"/>
+          <w:szCs w:val="27"/>
+          <w:lang w:val="en-SA"/>
+          <w14:ligatures w14:val="none"/>
+        </w:rPr>
+        <w:drawing>
+          <wp:inline distT="0" distB="0" distL="0" distR="0" wp14:anchorId="5CDB0064" wp14:editId="1386C214">
+            <wp:extent cx="5943600" cy="2908300"/>
+            <wp:effectExtent l="0" t="0" r="0" b="0"/>
+            <wp:docPr id="1029793855" name="Picture 1" descr="A computer screen with text&#10;&#10;AI-generated content may be incorrect."/>
+            <wp:cNvGraphicFramePr>
+              <a:graphicFrameLocks xmlns:a="http://schemas.openxmlformats.org/drawingml/2006/main" noChangeAspect="1"/>
+            </wp:cNvGraphicFramePr>
+            <a:graphic xmlns:a="http://schemas.openxmlformats.org/drawingml/2006/main">
+              <a:graphicData uri="http://schemas.openxmlformats.org/drawingml/2006/picture">
+                <pic:pic xmlns:pic="http://schemas.openxmlformats.org/drawingml/2006/picture">
+                  <pic:nvPicPr>
+                    <pic:cNvPr id="1029793855" name="Picture 1" descr="A computer screen with text&#10;&#10;AI-generated content may be incorrect."/>
+                    <pic:cNvPicPr/>
+                  </pic:nvPicPr>
+                  <pic:blipFill>
+                    <a:blip r:embed="rId10"/>
+                    <a:stretch>
+                      <a:fillRect/>
+                    </a:stretch>
+                  </pic:blipFill>
+                  <pic:spPr>
+                    <a:xfrm>
+                      <a:off x="0" y="0"/>
+                      <a:ext cx="5943600" cy="2908300"/>
+                    </a:xfrm>
+                    <a:prstGeom prst="rect">
+                      <a:avLst/>
+                    </a:prstGeom>
+                  </pic:spPr>
+                </pic:pic>
+              </a:graphicData>
+            </a:graphic>
+          </wp:inline>
+        </w:drawing>
+      </w:r>
+    </w:p>
+    <w:p>
+      <w:pPr>
+        <w:spacing w:after="0" w:line="240" w:lineRule="auto"/>
+        <w:rPr>
+          <w:rFonts w:ascii="Times New Roman" w:eastAsia="Times New Roman" w:hAnsi="Times New Roman" w:cs="Times New Roman"/>
+          <w:kern w:val="0"/>
+          <w:lang w:val="en-SA"/>
+          <w14:ligatures w14:val="none"/>
+        </w:rPr>
+      </w:pPr>
+      <w:r>
+        <w:rPr>
+          <w:rFonts w:ascii="Times New Roman" w:eastAsia="Times New Roman" w:hAnsi="Times New Roman" w:cs="Times New Roman"/>
+          <w:noProof/>
+          <w:kern w:val="0"/>
+          <w:lang w:val="en-SA"/>
+        </w:rPr>
+        <w:lastRenderedPageBreak/>
+        <w:pict w14:anchorId="40FDC5DF">
+          <v:rect id="_x0000_i1032" alt="" style="width:468pt;height:.05pt;mso-width-percent:0;mso-height-percent:0;mso-width-percent:0;mso-height-percent:0" o:hralign="center" o:hrstd="t" o:hr="t" fillcolor="#a0a0a0" stroked="f"/>
+        </w:pict>
+      </w:r>
+    </w:p>
+    <w:p>
+      <w:pPr>
+        <w:spacing w:before="100" w:beforeAutospacing="1" w:after="100" w:afterAutospacing="1" w:line="240" w:lineRule="auto"/>
+        <w:jc w:val="center"/>
+        <w:outlineLvl w:val="1"/>
+        <w:rPr>
+          <w:rFonts w:ascii="Times New Roman" w:eastAsia="Times New Roman" w:hAnsi="Times New Roman" w:cs="Times New Roman"/>
+          <w:b/>
+          <w:bCs/>
+          <w:i/>
+          <w:iCs/>
+          <w:kern w:val="0"/>
+          <w:sz w:val="36"/>
+          <w:szCs w:val="36"/>
+          <w:lang w:val="en-SA"/>
+          <w14:ligatures w14:val="none"/>
+        </w:rPr>
+      </w:pPr>
+      <w:r>
+        <w:rPr>
+          <w:rFonts w:ascii="Times New Roman" w:eastAsia="Times New Roman" w:hAnsi="Times New Roman" w:cs="Times New Roman"/>
+          <w:b/>
+          <w:bCs/>
+          <w:i/>
+          <w:iCs/>
+          <w:kern w:val="0"/>
+          <w:sz w:val="36"/>
+          <w:szCs w:val="36"/>
+          <w:lang w:val="en-SA"/>
+          <w14:ligatures w14:val="none"/>
+        </w:rPr>
+        <w:t>Verification After Fix</w:t>
+      </w:r>
+    </w:p>
+    <w:p>
+      <w:pPr>
+        <w:spacing w:before="100" w:beforeAutospacing="1" w:after="100" w:afterAutospacing="1" w:line="240" w:lineRule="auto"/>
+        <w:rPr>
+          <w:rFonts w:ascii="Times New Roman" w:eastAsia="Times New Roman" w:hAnsi="Times New Roman" w:cs="Times New Roman"/>
+          <w:kern w:val="0"/>
+          <w:lang w:val="en-SA"/>
+          <w14:ligatures w14:val="none"/>
+        </w:rPr>
+      </w:pPr>
+      <w:r>
+        <w:rPr>
+          <w:rFonts w:ascii="Times New Roman" w:eastAsia="Times New Roman" w:hAnsi="Times New Roman" w:cs="Times New Roman"/>
+          <w:kern w:val="0"/>
+          <w:lang w:val="en-SA"/>
+          <w14:ligatures w14:val="none"/>
+        </w:rPr>
+        <w:t>After applying the fix, the same attack steps were repeated.</w:t>
+      </w:r>
+    </w:p>
+    <w:p>
+      <w:pPr>
+        <w:spacing w:before="100" w:beforeAutospacing="1" w:after="100" w:afterAutospacing="1" w:line="240" w:lineRule="auto"/>
+        <w:rPr>
+          <w:rFonts w:ascii="Times New Roman" w:eastAsia="Times New Roman" w:hAnsi="Times New Roman" w:cs="Times New Roman"/>
+          <w:kern w:val="0"/>
+          <w:lang w:val="en-SA"/>
+          <w14:ligatures w14:val="none"/>
+        </w:rPr>
+      </w:pPr>
+      <w:r>
+        <w:rPr>
+          <w:rFonts w:ascii="Times New Roman" w:eastAsia="Times New Roman" w:hAnsi="Times New Roman" w:cs="Times New Roman"/>
+          <w:kern w:val="0"/>
+          <w:lang w:val="en-SA"/>
+          <w14:ligatures w14:val="none"/>
+        </w:rPr>
+        <w:t>A billing request was sent for a smaller quantity, followed immediately by an update request attempting to increase the quantity.</w:t>
+      </w:r>
+    </w:p>
+    <w:p>
+      <w:pPr>
+        <w:spacing w:before="100" w:beforeAutospacing="1" w:after="100" w:afterAutospacing="1" w:line="240" w:lineRule="auto"/>
+        <w:rPr>
+          <w:rFonts w:ascii="Times New Roman" w:eastAsia="Times New Roman" w:hAnsi="Times New Roman" w:cs="Times New Roman"/>
+          <w:kern w:val="0"/>
+          <w:lang w:val="en-SA"/>
+          <w14:ligatures w14:val="none"/>
+        </w:rPr>
+      </w:pPr>
+      <w:r>
+        <w:rPr>
+          <w:rFonts w:ascii="Times New Roman" w:eastAsia="Times New Roman" w:hAnsi="Times New Roman" w:cs="Times New Roman"/>
+          <w:kern w:val="0"/>
+          <w:lang w:val="en-SA"/>
+          <w14:ligatures w14:val="none"/>
+        </w:rPr>
+        <w:t>The system either rejected the update request or processed it only after billing was completed. The final receipt correctly matched the billed amount.</w:t>
+      </w:r>
+    </w:p>
+    <w:p>
+      <w:pPr>
+        <w:spacing w:before="100" w:beforeAutospacing="1" w:after="100" w:afterAutospacing="1" w:line="240" w:lineRule="auto"/>
+        <w:rPr>
+          <w:rFonts w:ascii="Times New Roman" w:eastAsia="Times New Roman" w:hAnsi="Times New Roman" w:cs="Times New Roman"/>
+          <w:kern w:val="0"/>
+          <w:lang w:val="en-SA"/>
+          <w14:ligatures w14:val="none"/>
+        </w:rPr>
+      </w:pPr>
+      <w:r>
+        <w:rPr>
+          <w:rFonts w:ascii="Times New Roman" w:eastAsia="Times New Roman" w:hAnsi="Times New Roman" w:cs="Times New Roman"/>
+          <w:kern w:val="0"/>
+          <w:lang w:val="en-SA"/>
+          <w14:ligatures w14:val="none"/>
+        </w:rPr>
+        <w:t>This confirms that the race condition vulnerability was successfully mitigated.</w:t>
+      </w:r>
+    </w:p>
+    <w:p>
+      <w:pPr>
+        <w:spacing w:after="0" w:line="240" w:lineRule="auto"/>
+        <w:rPr>
+          <w:rFonts w:ascii="Times New Roman" w:eastAsia="Times New Roman" w:hAnsi="Times New Roman" w:cs="Times New Roman"/>
+          <w:kern w:val="0"/>
+          <w:lang w:val="en-SA"/>
+          <w14:ligatures w14:val="none"/>
+        </w:rPr>
+      </w:pPr>
+      <w:r>
+        <w:rPr>
+          <w:rFonts w:ascii="Times New Roman" w:eastAsia="Times New Roman" w:hAnsi="Times New Roman" w:cs="Times New Roman"/>
+          <w:noProof/>
+          <w:kern w:val="0"/>
+          <w:lang w:val="en-SA"/>
+        </w:rPr>
+        <w:pict w14:anchorId="367CD597">
+          <v:rect id="_x0000_i1031" alt="" style="width:468pt;height:.05pt;mso-width-percent:0;mso-height-percent:0;mso-width-percent:0;mso-height-percent:0" o:hralign="center" o:hrstd="t" o:hr="t" fillcolor="#a0a0a0" stroked="f"/>
+        </w:pict>
+      </w:r>
+    </w:p>
+    <w:p>
+      <w:pPr>
+        <w:spacing w:before="100" w:beforeAutospacing="1" w:after="100" w:afterAutospacing="1" w:line="240" w:lineRule="auto"/>
+        <w:jc w:val="center"/>
+        <w:outlineLvl w:val="1"/>
+        <w:rPr>
+          <w:rFonts w:ascii="Times New Roman" w:eastAsia="Times New Roman" w:hAnsi="Times New Roman" w:cs="Times New Roman"/>
+          <w:b/>
+          <w:bCs/>
+          <w:i/>
+          <w:iCs/>
+          <w:kern w:val="0"/>
+          <w:sz w:val="36"/>
+          <w:szCs w:val="36"/>
+          <w:lang w:val="en-SA"/>
+          <w14:ligatures w14:val="none"/>
+        </w:rPr>
+      </w:pPr>
+      <w:r>
+        <w:rPr>
+          <w:rFonts w:ascii="Times New Roman" w:eastAsia="Times New Roman" w:hAnsi="Times New Roman" w:cs="Times New Roman"/>
+          <w:b/>
+          <w:bCs/>
+          <w:i/>
+          <w:iCs/>
+          <w:kern w:val="0"/>
+          <w:sz w:val="36"/>
+          <w:szCs w:val="36"/>
+          <w:lang w:val="en-SA"/>
+          <w14:ligatures w14:val="none"/>
+        </w:rPr>
+        <w:t>Structured Operation and Security Analysis</w:t>
+      </w:r>
+    </w:p>
+    <w:p>
+      <w:pPr>
+        <w:spacing w:before="100" w:beforeAutospacing="1" w:after="100" w:afterAutospacing="1" w:line="240" w:lineRule="auto"/>
+        <w:outlineLvl w:val="2"/>
+        <w:rPr>
+          <w:rFonts w:ascii="Times New Roman" w:eastAsia="Times New Roman" w:hAnsi="Times New Roman" w:cs="Times New Roman"/>
+          <w:b/>
+          <w:bCs/>
+          <w:kern w:val="0"/>
+          <w:sz w:val="27"/>
+          <w:szCs w:val="27"/>
+          <w:lang w:val="en-SA"/>
+          <w14:ligatures w14:val="none"/>
+        </w:rPr>
+      </w:pPr>
+      <w:r>
+        <w:rPr>
+          <w:rFonts w:ascii="Times New Roman" w:eastAsia="Times New Roman" w:hAnsi="Times New Roman" w:cs="Times New Roman"/>
+          <w:b/>
+          <w:bCs/>
+          <w:kern w:val="0"/>
+          <w:sz w:val="27"/>
+          <w:szCs w:val="27"/>
+          <w:lang w:val="en-SA"/>
+          <w14:ligatures w14:val="none"/>
+        </w:rPr>
+        <w:t>1) Intended Logic and Security Rule(s)</w:t>
+      </w:r>
+    </w:p>
+    <w:p>
+      <w:pPr>
+        <w:spacing w:before="100" w:beforeAutospacing="1" w:after="100" w:afterAutospacing="1" w:line="240" w:lineRule="auto"/>
+        <w:rPr>
+          <w:rFonts w:ascii="Times New Roman" w:eastAsia="Times New Roman" w:hAnsi="Times New Roman" w:cs="Times New Roman"/>
+          <w:kern w:val="0"/>
+          <w:lang w:val="en-SA"/>
+          <w14:ligatures w14:val="none"/>
+        </w:rPr>
+      </w:pPr>
+      <w:r>
+        <w:rPr>
+          <w:rFonts w:ascii="Times New Roman" w:eastAsia="Times New Roman" w:hAnsi="Times New Roman" w:cs="Times New Roman"/>
+          <w:kern w:val="0"/>
+          <w:lang w:val="en-SA"/>
+          <w14:ligatures w14:val="none"/>
+        </w:rPr>
+        <w:t>Under normal conditions, the system should process billing and order updates in a controlled sequence. Once billing begins, the order state should remain unchanged until the transaction is complete.</w:t>
+      </w:r>
+    </w:p>
+    <w:p>
+      <w:pPr>
+        <w:spacing w:before="100" w:beforeAutospacing="1" w:after="100" w:afterAutospacing="1" w:line="240" w:lineRule="auto"/>
+        <w:rPr>
+          <w:rFonts w:ascii="Times New Roman" w:eastAsia="Times New Roman" w:hAnsi="Times New Roman" w:cs="Times New Roman"/>
+          <w:b/>
+          <w:bCs/>
+          <w:kern w:val="0"/>
+          <w:lang w:val="en-SA"/>
+          <w14:ligatures w14:val="none"/>
+        </w:rPr>
+      </w:pPr>
+      <w:r>
+        <w:rPr>
+          <w:rFonts w:ascii="Times New Roman" w:eastAsia="Times New Roman" w:hAnsi="Times New Roman" w:cs="Times New Roman"/>
+          <w:b/>
+          <w:bCs/>
+          <w:kern w:val="0"/>
+          <w:lang w:val="en-SA"/>
+          <w14:ligatures w14:val="none"/>
+        </w:rPr>
+        <w:t>The main security rules are:</w:t>
+      </w:r>
+    </w:p>
+    <w:p>
+      <w:pPr>
+        <w:spacing w:before="100" w:beforeAutospacing="1" w:after="100" w:afterAutospacing="1" w:line="240" w:lineRule="auto"/>
+        <w:rPr>
+          <w:rFonts w:ascii="Times New Roman" w:eastAsia="Times New Roman" w:hAnsi="Times New Roman" w:cs="Times New Roman"/>
+          <w:kern w:val="0"/>
+          <w:lang w:val="en-SA"/>
+          <w14:ligatures w14:val="none"/>
+        </w:rPr>
+      </w:pPr>
+      <w:r>
+        <w:rPr>
+          <w:rFonts w:ascii="Times New Roman" w:eastAsia="Times New Roman" w:hAnsi="Times New Roman" w:cs="Times New Roman"/>
+          <w:kern w:val="0"/>
+          <w:lang w:val="en-SA"/>
+          <w14:ligatures w14:val="none"/>
+        </w:rPr>
+        <w:t>The system must prevent updates during billing</w:t>
+      </w:r>
+      <w:r>
+        <w:rPr>
+          <w:rFonts w:ascii="Times New Roman" w:eastAsia="Times New Roman" w:hAnsi="Times New Roman" w:cs="Times New Roman"/>
+          <w:kern w:val="0"/>
+          <w:lang w:val="en-SA"/>
+          <w14:ligatures w14:val="none"/>
+        </w:rPr>
+        <w:br/>
+        <w:t>The system must ensure consistency between billed amount and final order</w:t>
+      </w:r>
+      <w:r>
+        <w:rPr>
+          <w:rFonts w:ascii="Times New Roman" w:eastAsia="Times New Roman" w:hAnsi="Times New Roman" w:cs="Times New Roman"/>
+          <w:kern w:val="0"/>
+          <w:lang w:val="en-SA"/>
+          <w14:ligatures w14:val="none"/>
+        </w:rPr>
+        <w:br/>
+        <w:t>The system must process related operations atomically</w:t>
+      </w:r>
+    </w:p>
+    <w:p>
+      <w:pPr>
+        <w:spacing w:after="0" w:line="240" w:lineRule="auto"/>
+        <w:rPr>
+          <w:rFonts w:ascii="Times New Roman" w:eastAsia="Times New Roman" w:hAnsi="Times New Roman" w:cs="Times New Roman"/>
+          <w:kern w:val="0"/>
+          <w:lang w:val="en-SA"/>
+          <w14:ligatures w14:val="none"/>
+        </w:rPr>
+      </w:pPr>
+      <w:r>
+        <w:rPr>
+          <w:rFonts w:ascii="Times New Roman" w:eastAsia="Times New Roman" w:hAnsi="Times New Roman" w:cs="Times New Roman"/>
+          <w:noProof/>
+          <w:kern w:val="0"/>
+          <w:lang w:val="en-SA"/>
+        </w:rPr>
+        <w:pict w14:anchorId="6E1AE00A">
+          <v:rect id="_x0000_i1030" alt="" style="width:468pt;height:.05pt;mso-width-percent:0;mso-height-percent:0;mso-width-percent:0;mso-height-percent:0" o:hralign="center" o:hrstd="t" o:hr="t" fillcolor="#a0a0a0" stroked="f"/>
+        </w:pict>
+      </w:r>
+    </w:p>
+    <w:p>
+      <w:pPr>
+        <w:spacing w:before="100" w:beforeAutospacing="1" w:after="100" w:afterAutospacing="1" w:line="240" w:lineRule="auto"/>
+        <w:outlineLvl w:val="2"/>
+        <w:rPr>
+          <w:rFonts w:ascii="Times New Roman" w:eastAsia="Times New Roman" w:hAnsi="Times New Roman" w:cs="Times New Roman"/>
+          <w:b/>
+          <w:bCs/>
+          <w:kern w:val="0"/>
+          <w:sz w:val="27"/>
+          <w:szCs w:val="27"/>
+          <w:lang w:val="en-SA"/>
+          <w14:ligatures w14:val="none"/>
+        </w:rPr>
+      </w:pPr>
+      <w:r>
+        <w:rPr>
+          <w:rFonts w:ascii="Times New Roman" w:eastAsia="Times New Roman" w:hAnsi="Times New Roman" w:cs="Times New Roman"/>
+          <w:b/>
+          <w:bCs/>
+          <w:kern w:val="0"/>
+          <w:sz w:val="27"/>
+          <w:szCs w:val="27"/>
+          <w:lang w:val="en-SA"/>
+          <w14:ligatures w14:val="none"/>
+        </w:rPr>
+        <w:t>2) Evidence Sources and Behavior Trace</w:t>
+      </w:r>
+    </w:p>
+    <w:p>
+      <w:pPr>
+        <w:spacing w:before="100" w:beforeAutospacing="1" w:after="100" w:afterAutospacing="1" w:line="240" w:lineRule="auto"/>
+        <w:rPr>
+          <w:rFonts w:ascii="Times New Roman" w:eastAsia="Times New Roman" w:hAnsi="Times New Roman" w:cs="Times New Roman"/>
+          <w:kern w:val="0"/>
+          <w:lang w:val="en-SA"/>
+          <w14:ligatures w14:val="none"/>
+        </w:rPr>
+      </w:pPr>
+      <w:r>
+        <w:rPr>
+          <w:rFonts w:ascii="Times New Roman" w:eastAsia="Times New Roman" w:hAnsi="Times New Roman" w:cs="Times New Roman"/>
+          <w:kern w:val="0"/>
+          <w:lang w:val="en-SA"/>
+          <w14:ligatures w14:val="none"/>
+        </w:rPr>
+        <w:t>The analysis was based on API request and response outputs, frontend receipt data, and controlled request timing.</w:t>
+      </w:r>
+    </w:p>
+    <w:p>
+      <w:pPr>
+        <w:spacing w:before="100" w:beforeAutospacing="1" w:after="100" w:afterAutospacing="1" w:line="240" w:lineRule="auto"/>
+        <w:rPr>
+          <w:rFonts w:ascii="Times New Roman" w:eastAsia="Times New Roman" w:hAnsi="Times New Roman" w:cs="Times New Roman"/>
+          <w:kern w:val="0"/>
+          <w:lang w:val="en-SA"/>
+          <w14:ligatures w14:val="none"/>
+        </w:rPr>
+      </w:pPr>
+      <w:r>
+        <w:rPr>
+          <w:rFonts w:ascii="Times New Roman" w:eastAsia="Times New Roman" w:hAnsi="Times New Roman" w:cs="Times New Roman"/>
+          <w:kern w:val="0"/>
+          <w:lang w:val="en-SA"/>
+          <w14:ligatures w14:val="none"/>
+        </w:rPr>
+        <w:t>The behavior comparison is as follows:</w:t>
+      </w:r>
+    </w:p>
+    <w:p>
+      <w:pPr>
+        <w:spacing w:before="100" w:beforeAutospacing="1" w:after="100" w:afterAutospacing="1" w:line="240" w:lineRule="auto"/>
+        <w:rPr>
+          <w:rFonts w:ascii="Times New Roman" w:eastAsia="Times New Roman" w:hAnsi="Times New Roman" w:cs="Times New Roman"/>
+          <w:kern w:val="0"/>
+          <w:lang w:val="en-SA"/>
+          <w14:ligatures w14:val="none"/>
+        </w:rPr>
+      </w:pPr>
+      <w:r>
+        <w:rPr>
+          <w:rFonts w:ascii="Times New Roman" w:eastAsia="Times New Roman" w:hAnsi="Times New Roman" w:cs="Times New Roman"/>
+          <w:b/>
+          <w:bCs/>
+          <w:kern w:val="0"/>
+          <w:lang w:val="en-SA"/>
+          <w14:ligatures w14:val="none"/>
+        </w:rPr>
+        <w:t>Normal Behavior:</w:t>
+      </w:r>
+      <w:r>
+        <w:rPr>
+          <w:rFonts w:ascii="Times New Roman" w:eastAsia="Times New Roman" w:hAnsi="Times New Roman" w:cs="Times New Roman"/>
+          <w:b/>
+          <w:bCs/>
+          <w:kern w:val="0"/>
+          <w:lang w:val="en-SA"/>
+          <w14:ligatures w14:val="none"/>
+        </w:rPr>
+        <w:br/>
+      </w:r>
+      <w:r>
+        <w:rPr>
+          <w:rFonts w:ascii="Times New Roman" w:eastAsia="Times New Roman" w:hAnsi="Times New Roman" w:cs="Times New Roman"/>
+          <w:kern w:val="0"/>
+          <w:lang w:val="en-SA"/>
+          <w14:ligatures w14:val="none"/>
+        </w:rPr>
+        <w:t>The user updates the order, then completes billing, and the final receipt matches the billed amount.</w:t>
+      </w:r>
+    </w:p>
+    <w:p>
+      <w:pPr>
+        <w:spacing w:before="100" w:beforeAutospacing="1" w:after="100" w:afterAutospacing="1" w:line="240" w:lineRule="auto"/>
+        <w:rPr>
+          <w:rFonts w:ascii="Times New Roman" w:eastAsia="Times New Roman" w:hAnsi="Times New Roman" w:cs="Times New Roman"/>
+          <w:kern w:val="0"/>
+          <w:lang w:val="en-SA"/>
+          <w14:ligatures w14:val="none"/>
+        </w:rPr>
+      </w:pPr>
+      <w:r>
+        <w:rPr>
+          <w:rFonts w:ascii="Times New Roman" w:eastAsia="Times New Roman" w:hAnsi="Times New Roman" w:cs="Times New Roman"/>
+          <w:b/>
+          <w:bCs/>
+          <w:kern w:val="0"/>
+          <w:lang w:val="en-SA"/>
+          <w14:ligatures w14:val="none"/>
+        </w:rPr>
+        <w:lastRenderedPageBreak/>
+        <w:t>Exploit Behavior:</w:t>
+      </w:r>
+      <w:r>
+        <w:rPr>
+          <w:rFonts w:ascii="Times New Roman" w:eastAsia="Times New Roman" w:hAnsi="Times New Roman" w:cs="Times New Roman"/>
+          <w:b/>
+          <w:bCs/>
+          <w:kern w:val="0"/>
+          <w:lang w:val="en-SA"/>
+          <w14:ligatures w14:val="none"/>
+        </w:rPr>
+        <w:br/>
+      </w:r>
+      <w:r>
+        <w:rPr>
+          <w:rFonts w:ascii="Times New Roman" w:eastAsia="Times New Roman" w:hAnsi="Times New Roman" w:cs="Times New Roman"/>
+          <w:kern w:val="0"/>
+          <w:lang w:val="en-SA"/>
+          <w14:ligatures w14:val="none"/>
+        </w:rPr>
+        <w:t>The attacker sends a billing request followed immediately by an update request. The system charges based on the original quantity but stores the updated quantity.</w:t>
+      </w:r>
+    </w:p>
+    <w:p>
+      <w:pPr>
+        <w:spacing w:before="100" w:beforeAutospacing="1" w:after="100" w:afterAutospacing="1" w:line="240" w:lineRule="auto"/>
+        <w:rPr>
+          <w:rFonts w:ascii="Times New Roman" w:eastAsia="Times New Roman" w:hAnsi="Times New Roman" w:cs="Times New Roman"/>
+          <w:kern w:val="0"/>
+          <w:lang w:val="en-SA"/>
+          <w14:ligatures w14:val="none"/>
+        </w:rPr>
+      </w:pPr>
+      <w:r>
+        <w:rPr>
+          <w:rFonts w:ascii="Times New Roman" w:eastAsia="Times New Roman" w:hAnsi="Times New Roman" w:cs="Times New Roman"/>
+          <w:b/>
+          <w:bCs/>
+          <w:kern w:val="0"/>
+          <w:lang w:val="en-SA"/>
+          <w14:ligatures w14:val="none"/>
+        </w:rPr>
+        <w:t>Post-Fix Behavior:</w:t>
+      </w:r>
+      <w:r>
+        <w:rPr>
+          <w:rFonts w:ascii="Times New Roman" w:eastAsia="Times New Roman" w:hAnsi="Times New Roman" w:cs="Times New Roman"/>
+          <w:kern w:val="0"/>
+          <w:lang w:val="en-SA"/>
+          <w14:ligatures w14:val="none"/>
+        </w:rPr>
+        <w:br/>
+        <w:t>The system prevents updates during billing, and the final receipt always matches the billed amount.</w:t>
+      </w:r>
+    </w:p>
+    <w:p>
+      <w:pPr>
+        <w:spacing w:after="0" w:line="240" w:lineRule="auto"/>
+        <w:rPr>
+          <w:rFonts w:ascii="Times New Roman" w:eastAsia="Times New Roman" w:hAnsi="Times New Roman" w:cs="Times New Roman"/>
+          <w:kern w:val="0"/>
+          <w:lang w:val="en-SA"/>
+          <w14:ligatures w14:val="none"/>
+        </w:rPr>
+      </w:pPr>
+      <w:r>
+        <w:rPr>
+          <w:rFonts w:ascii="Times New Roman" w:eastAsia="Times New Roman" w:hAnsi="Times New Roman" w:cs="Times New Roman"/>
+          <w:noProof/>
+          <w:kern w:val="0"/>
+          <w:lang w:val="en-SA"/>
+        </w:rPr>
+        <w:pict w14:anchorId="1811C5D6">
+          <v:rect id="_x0000_i1029" alt="" style="width:468pt;height:.05pt;mso-width-percent:0;mso-height-percent:0;mso-width-percent:0;mso-height-percent:0" o:hralign="center" o:hrstd="t" o:hr="t" fillcolor="#a0a0a0" stroked="f"/>
+        </w:pict>
+      </w:r>
+    </w:p>
+    <w:p>
+      <w:pPr>
+        <w:spacing w:before="100" w:beforeAutospacing="1" w:after="100" w:afterAutospacing="1" w:line="240" w:lineRule="auto"/>
+        <w:outlineLvl w:val="2"/>
+        <w:rPr>
+          <w:rFonts w:ascii="Times New Roman" w:eastAsia="Times New Roman" w:hAnsi="Times New Roman" w:cs="Times New Roman"/>
+          <w:b/>
+          <w:bCs/>
+          <w:kern w:val="0"/>
+          <w:sz w:val="27"/>
+          <w:szCs w:val="27"/>
+          <w:lang w:val="en-SA"/>
+          <w14:ligatures w14:val="none"/>
+        </w:rPr>
+      </w:pPr>
+      <w:r>
+        <w:rPr>
+          <w:rFonts w:ascii="Times New Roman" w:eastAsia="Times New Roman" w:hAnsi="Times New Roman" w:cs="Times New Roman"/>
+          <w:b/>
+          <w:bCs/>
+          <w:kern w:val="0"/>
+          <w:sz w:val="27"/>
+          <w:szCs w:val="27"/>
+          <w:lang w:val="en-SA"/>
+          <w14:ligatures w14:val="none"/>
+        </w:rPr>
+        <w:t>3) Deviation Analysis and Classification</w:t>
+      </w:r>
+    </w:p>
+    <w:p>
+      <w:pPr>
+        <w:spacing w:before="100" w:beforeAutospacing="1" w:after="100" w:afterAutospacing="1" w:line="240" w:lineRule="auto"/>
+        <w:rPr>
+          <w:rFonts w:ascii="Times New Roman" w:eastAsia="Times New Roman" w:hAnsi="Times New Roman" w:cs="Times New Roman"/>
+          <w:kern w:val="0"/>
+          <w:lang w:val="en-SA"/>
+          <w14:ligatures w14:val="none"/>
+        </w:rPr>
+      </w:pPr>
+      <w:r>
+        <w:rPr>
+          <w:rFonts w:ascii="Times New Roman" w:eastAsia="Times New Roman" w:hAnsi="Times New Roman" w:cs="Times New Roman"/>
+          <w:kern w:val="0"/>
+          <w:lang w:val="en-SA"/>
+          <w14:ligatures w14:val="none"/>
+        </w:rPr>
+        <w:t>The exploit behavior represents a deviation from the intended logic because the system allows concurrent modification of the order during billing. This violates the requirement for consistency between billing and order state.</w:t>
+      </w:r>
+    </w:p>
+    <w:p>
+      <w:pPr>
+        <w:spacing w:before="100" w:beforeAutospacing="1" w:after="100" w:afterAutospacing="1" w:line="240" w:lineRule="auto"/>
+        <w:rPr>
+          <w:rFonts w:ascii="Times New Roman" w:eastAsia="Times New Roman" w:hAnsi="Times New Roman" w:cs="Times New Roman"/>
+          <w:kern w:val="0"/>
+          <w:lang w:val="en-SA"/>
+          <w14:ligatures w14:val="none"/>
+        </w:rPr>
+      </w:pPr>
+      <w:r>
+        <w:rPr>
+          <w:rFonts w:ascii="Times New Roman" w:eastAsia="Times New Roman" w:hAnsi="Times New Roman" w:cs="Times New Roman"/>
+          <w:kern w:val="0"/>
+          <w:lang w:val="en-SA"/>
+          <w14:ligatures w14:val="none"/>
+        </w:rPr>
+        <w:t>This case is classified as:</w:t>
+      </w:r>
+    </w:p>
+    <w:p>
+      <w:pPr>
+        <w:spacing w:before="100" w:beforeAutospacing="1" w:after="100" w:afterAutospacing="1" w:line="240" w:lineRule="auto"/>
+        <w:rPr>
+          <w:rFonts w:ascii="Times New Roman" w:eastAsia="Times New Roman" w:hAnsi="Times New Roman" w:cs="Times New Roman"/>
+          <w:kern w:val="0"/>
+          <w:lang w:val="en-SA"/>
+          <w14:ligatures w14:val="none"/>
+        </w:rPr>
+      </w:pPr>
+      <w:r>
+        <w:rPr>
+          <w:rFonts w:ascii="Times New Roman" w:eastAsia="Times New Roman" w:hAnsi="Times New Roman" w:cs="Times New Roman"/>
+          <w:kern w:val="0"/>
+          <w:lang w:val="en-SA"/>
+          <w14:ligatures w14:val="none"/>
+        </w:rPr>
+        <w:t>Intentional misuse / security-relevant abuse</w:t>
+      </w:r>
+    </w:p>
+    <w:p>
+      <w:pPr>
+        <w:spacing w:after="0" w:line="240" w:lineRule="auto"/>
+        <w:rPr>
+          <w:rFonts w:ascii="Times New Roman" w:eastAsia="Times New Roman" w:hAnsi="Times New Roman" w:cs="Times New Roman"/>
+          <w:kern w:val="0"/>
+          <w:lang w:val="en-SA"/>
+          <w14:ligatures w14:val="none"/>
+        </w:rPr>
+      </w:pPr>
+      <w:r>
+        <w:rPr>
+          <w:rFonts w:ascii="Times New Roman" w:eastAsia="Times New Roman" w:hAnsi="Times New Roman" w:cs="Times New Roman"/>
+          <w:noProof/>
+          <w:kern w:val="0"/>
+          <w:lang w:val="en-SA"/>
+        </w:rPr>
+        <w:pict w14:anchorId="7CDF7349">
+          <v:rect id="_x0000_i1028" alt="" style="width:468pt;height:.05pt;mso-width-percent:0;mso-height-percent:0;mso-width-percent:0;mso-height-percent:0" o:hralign="center" o:hrstd="t" o:hr="t" fillcolor="#a0a0a0" stroked="f"/>
+        </w:pict>
+      </w:r>
+    </w:p>
+    <w:p>
+      <w:pPr>
+        <w:spacing w:before="100" w:beforeAutospacing="1" w:after="100" w:afterAutospacing="1" w:line="240" w:lineRule="auto"/>
+        <w:outlineLvl w:val="2"/>
+        <w:rPr>
+          <w:rFonts w:ascii="Times New Roman" w:eastAsia="Times New Roman" w:hAnsi="Times New Roman" w:cs="Times New Roman"/>
+          <w:b/>
+          <w:bCs/>
+          <w:kern w:val="0"/>
+          <w:sz w:val="27"/>
+          <w:szCs w:val="27"/>
+          <w:lang w:val="en-SA"/>
+          <w14:ligatures w14:val="none"/>
+        </w:rPr>
+      </w:pPr>
+      <w:r>
+        <w:rPr>
+          <w:rFonts w:ascii="Times New Roman" w:eastAsia="Times New Roman" w:hAnsi="Times New Roman" w:cs="Times New Roman"/>
+          <w:b/>
+          <w:bCs/>
+          <w:kern w:val="0"/>
+          <w:sz w:val="27"/>
+          <w:szCs w:val="27"/>
+          <w:lang w:val="en-SA"/>
+          <w14:ligatures w14:val="none"/>
+        </w:rPr>
+        <w:t>4) Explainable Fix and Post-Fix Validation</w:t>
+      </w:r>
+    </w:p>
+    <w:p>
+      <w:pPr>
+        <w:spacing w:before="100" w:beforeAutospacing="1" w:after="100" w:afterAutospacing="1" w:line="240" w:lineRule="auto"/>
+        <w:rPr>
+          <w:rFonts w:ascii="Times New Roman" w:eastAsia="Times New Roman" w:hAnsi="Times New Roman" w:cs="Times New Roman"/>
+          <w:kern w:val="0"/>
+          <w:lang w:val="en-SA"/>
+          <w14:ligatures w14:val="none"/>
+        </w:rPr>
+      </w:pPr>
+      <w:r>
+        <w:rPr>
+          <w:rFonts w:ascii="Times New Roman" w:eastAsia="Times New Roman" w:hAnsi="Times New Roman" w:cs="Times New Roman"/>
+          <w:kern w:val="0"/>
+          <w:lang w:val="en-SA"/>
+          <w14:ligatures w14:val="none"/>
+        </w:rPr>
+        <w:t>The incorrect assumption in the system was that billing and update requests would not interfere with each other. The fix ensures that order state remains stable during billing by enforcing synchronization and validation.</w:t>
+      </w:r>
+    </w:p>
+    <w:p>
+      <w:pPr>
+        <w:spacing w:before="100" w:beforeAutospacing="1" w:after="100" w:afterAutospacing="1" w:line="240" w:lineRule="auto"/>
+        <w:rPr>
+          <w:rFonts w:ascii="Times New Roman" w:eastAsia="Times New Roman" w:hAnsi="Times New Roman" w:cs="Times New Roman"/>
+          <w:kern w:val="0"/>
+          <w:lang w:val="en-SA"/>
+          <w14:ligatures w14:val="none"/>
+        </w:rPr>
+      </w:pPr>
+      <w:r>
+        <w:rPr>
+          <w:rFonts w:ascii="Times New Roman" w:eastAsia="Times New Roman" w:hAnsi="Times New Roman" w:cs="Times New Roman"/>
+          <w:kern w:val="0"/>
+          <w:lang w:val="en-SA"/>
+          <w14:ligatures w14:val="none"/>
+        </w:rPr>
+        <w:t>After the fix, the system correctly maintains consistency, and the vulnerability can no longer be exploited.</w:t>
+      </w:r>
+    </w:p>
+    <w:p>
+      <w:pPr>
+        <w:spacing w:after="0" w:line="240" w:lineRule="auto"/>
+        <w:rPr>
+          <w:rFonts w:ascii="Times New Roman" w:eastAsia="Times New Roman" w:hAnsi="Times New Roman" w:cs="Times New Roman"/>
+          <w:kern w:val="0"/>
+          <w:lang w:val="en-SA"/>
+          <w14:ligatures w14:val="none"/>
+        </w:rPr>
+      </w:pPr>
+      <w:r>
+        <w:rPr>
+          <w:rFonts w:ascii="Times New Roman" w:eastAsia="Times New Roman" w:hAnsi="Times New Roman" w:cs="Times New Roman"/>
+          <w:noProof/>
+          <w:kern w:val="0"/>
+          <w:lang w:val="en-SA"/>
+        </w:rPr>
+        <w:pict w14:anchorId="2356C1D7">
+          <v:rect id="_x0000_i1027" alt="" style="width:468pt;height:.05pt;mso-width-percent:0;mso-height-percent:0;mso-width-percent:0;mso-height-percent:0" o:hralign="center" o:hrstd="t" o:hr="t" fillcolor="#a0a0a0" stroked="f"/>
+        </w:pict>
+      </w:r>
+    </w:p>
+    <w:p>
+      <w:pPr>
+        <w:spacing w:before="100" w:beforeAutospacing="1" w:after="100" w:afterAutospacing="1" w:line="240" w:lineRule="auto"/>
+        <w:jc w:val="center"/>
+        <w:outlineLvl w:val="1"/>
+        <w:rPr>
+          <w:rFonts w:ascii="Times New Roman" w:eastAsia="Times New Roman" w:hAnsi="Times New Roman" w:cs="Times New Roman"/>
+          <w:b/>
+          <w:bCs/>
+          <w:i/>
+          <w:iCs/>
+          <w:kern w:val="0"/>
+          <w:sz w:val="36"/>
+          <w:szCs w:val="36"/>
+          <w:lang w:val="en-SA"/>
+          <w14:ligatures w14:val="none"/>
+        </w:rPr>
+      </w:pPr>
+    </w:p>
+    <w:p>
+      <w:pPr>
+        <w:spacing w:before="100" w:beforeAutospacing="1" w:after="100" w:afterAutospacing="1" w:line="240" w:lineRule="auto"/>
+        <w:jc w:val="center"/>
+        <w:outlineLvl w:val="1"/>
+        <w:rPr>
+          <w:rFonts w:ascii="Times New Roman" w:eastAsia="Times New Roman" w:hAnsi="Times New Roman" w:cs="Times New Roman"/>
+          <w:b/>
+          <w:bCs/>
+          <w:i/>
+          <w:iCs/>
+          <w:kern w:val="0"/>
+          <w:sz w:val="36"/>
+          <w:szCs w:val="36"/>
+          <w:lang w:val="en-SA"/>
+          <w14:ligatures w14:val="none"/>
+        </w:rPr>
+      </w:pPr>
+    </w:p>
+    <w:p>
+      <w:pPr>
+        <w:spacing w:before="100" w:beforeAutospacing="1" w:after="100" w:afterAutospacing="1" w:line="240" w:lineRule="auto"/>
+        <w:jc w:val="center"/>
+        <w:outlineLvl w:val="1"/>
+        <w:rPr>
+          <w:rFonts w:ascii="Times New Roman" w:eastAsia="Times New Roman" w:hAnsi="Times New Roman" w:cs="Times New Roman"/>
+          <w:b/>
+          <w:bCs/>
+          <w:i/>
+          <w:iCs/>
+          <w:kern w:val="0"/>
+          <w:sz w:val="36"/>
+          <w:szCs w:val="36"/>
+          <w:lang w:val="en-SA"/>
+          <w14:ligatures w14:val="none"/>
+        </w:rPr>
+      </w:pPr>
+    </w:p>
+    <w:p>
+      <w:pPr>
+        <w:spacing w:before="100" w:beforeAutospacing="1" w:after="100" w:afterAutospacing="1" w:line="240" w:lineRule="auto"/>
+        <w:jc w:val="center"/>
+        <w:outlineLvl w:val="1"/>
+        <w:rPr>
+          <w:rFonts w:ascii="Times New Roman" w:eastAsia="Times New Roman" w:hAnsi="Times New Roman" w:cs="Times New Roman"/>
+          <w:b/>
+          <w:bCs/>
+          <w:i/>
+          <w:iCs/>
+          <w:kern w:val="0"/>
+          <w:sz w:val="36"/>
+          <w:szCs w:val="36"/>
+          <w:lang w:val="en-SA"/>
+          <w14:ligatures w14:val="none"/>
+        </w:rPr>
+      </w:pPr>
+    </w:p>
+    <w:p>
+      <w:pPr>
+        <w:spacing w:before="100" w:beforeAutospacing="1" w:after="100" w:afterAutospacing="1" w:line="240" w:lineRule="auto"/>
+        <w:jc w:val="center"/>
+        <w:outlineLvl w:val="1"/>
+        <w:rPr>
+          <w:rFonts w:ascii="Times New Roman" w:eastAsia="Times New Roman" w:hAnsi="Times New Roman" w:cs="Times New Roman"/>
+          <w:b/>
+          <w:bCs/>
+          <w:i/>
+          <w:iCs/>
+          <w:kern w:val="0"/>
+          <w:sz w:val="36"/>
+          <w:szCs w:val="36"/>
+          <w:lang w:val="en-SA"/>
+          <w14:ligatures w14:val="none"/>
+        </w:rPr>
+      </w:pPr>
+    </w:p>
+    <w:p>
+      <w:pPr>
+        <w:spacing w:before="100" w:beforeAutospacing="1" w:after="100" w:afterAutospacing="1" w:line="240" w:lineRule="auto"/>
+        <w:jc w:val="center"/>
+        <w:outlineLvl w:val="1"/>
+        <w:rPr>
+          <w:rFonts w:ascii="Times New Roman" w:eastAsia="Times New Roman" w:hAnsi="Times New Roman" w:cs="Times New Roman"/>
+          <w:b/>
+          <w:bCs/>
+          <w:i/>
+          <w:iCs/>
+          <w:kern w:val="0"/>
+          <w:sz w:val="36"/>
+          <w:szCs w:val="36"/>
+          <w:lang w:val="en-SA"/>
+          <w14:ligatures w14:val="none"/>
+        </w:rPr>
+      </w:pPr>
+      <w:r>
+        <w:rPr>
+          <w:rFonts w:ascii="Times New Roman" w:eastAsia="Times New Roman" w:hAnsi="Times New Roman" w:cs="Times New Roman"/>
+          <w:b/>
+          <w:bCs/>
+          <w:i/>
+          <w:iCs/>
+          <w:kern w:val="0"/>
+          <w:sz w:val="36"/>
+          <w:szCs w:val="36"/>
+          <w:lang w:val="en-SA"/>
+          <w14:ligatures w14:val="none"/>
+        </w:rPr>
+        <w:lastRenderedPageBreak/>
+        <w:t>Summary Tables</w:t>
+      </w:r>
+    </w:p>
+    <w:tbl>
+      <w:tblPr>
+        <w:tblStyle w:val="TableGrid"/>
+        <w:tblW w:w="0" w:type="auto"/>
+        <w:tblLook w:val="04A0" w:firstRow="1" w:lastRow="0" w:firstColumn="1" w:lastColumn="0" w:noHBand="0" w:noVBand="1"/>
+      </w:tblPr>
+      <w:tblGrid>
+        <w:gridCol w:w="1870"/>
+        <w:gridCol w:w="1870"/>
+        <w:gridCol w:w="1870"/>
+        <w:gridCol w:w="1870"/>
+        <w:gridCol w:w="1870"/>
+      </w:tblGrid>
+      <w:tr>
+        <w:tc>
+          <w:tcPr>
+            <w:tcW w:w="1870" w:type="dxa"/>
+          </w:tcPr>
+          <w:p>
+            <w:pPr>
+              <w:spacing w:before="100" w:beforeAutospacing="1" w:after="100" w:afterAutospacing="1"/>
+              <w:outlineLvl w:val="2"/>
+              <w:rPr>
+                <w:rFonts w:ascii="Times New Roman" w:eastAsia="Times New Roman" w:hAnsi="Times New Roman" w:cs="Times New Roman"/>
+                <w:b/>
+                <w:bCs/>
+                <w:kern w:val="0"/>
+                <w:sz w:val="27"/>
+                <w:szCs w:val="27"/>
+                <w:lang w:val="en-SA"/>
+                <w14:ligatures w14:val="none"/>
+              </w:rPr>
+            </w:pPr>
+            <w:r>
+              <w:rPr>
+                <w:rFonts w:ascii="Times New Roman" w:eastAsia="Times New Roman" w:hAnsi="Times New Roman" w:cs="Times New Roman"/>
+                <w:b/>
+                <w:bCs/>
+                <w:kern w:val="0"/>
+                <w:sz w:val="27"/>
+                <w:szCs w:val="27"/>
+                <w:lang w:val="en-SA"/>
+                <w14:ligatures w14:val="none"/>
+              </w:rPr>
+              <w:t>Table 1</w:t>
+            </w:r>
+          </w:p>
+        </w:tc>
+        <w:tc>
+          <w:tcPr>
+            <w:tcW w:w="1870" w:type="dxa"/>
+          </w:tcPr>
+          <w:p>
+            <w:pPr>
+              <w:spacing w:before="100" w:beforeAutospacing="1" w:after="100" w:afterAutospacing="1"/>
+              <w:outlineLvl w:val="2"/>
+              <w:rPr>
+                <w:rFonts w:ascii="Times New Roman" w:eastAsia="Times New Roman" w:hAnsi="Times New Roman" w:cs="Times New Roman"/>
+                <w:b/>
+                <w:bCs/>
+                <w:kern w:val="0"/>
+                <w:sz w:val="27"/>
+                <w:szCs w:val="27"/>
+                <w:lang w:val="en-SA"/>
+                <w14:ligatures w14:val="none"/>
+              </w:rPr>
+            </w:pPr>
+          </w:p>
+        </w:tc>
+        <w:tc>
+          <w:tcPr>
+            <w:tcW w:w="1870" w:type="dxa"/>
+          </w:tcPr>
+          <w:p>
+            <w:pPr>
+              <w:spacing w:before="100" w:beforeAutospacing="1" w:after="100" w:afterAutospacing="1"/>
+              <w:outlineLvl w:val="2"/>
+              <w:rPr>
+                <w:rFonts w:ascii="Times New Roman" w:eastAsia="Times New Roman" w:hAnsi="Times New Roman" w:cs="Times New Roman"/>
+                <w:b/>
+                <w:bCs/>
+                <w:kern w:val="0"/>
+                <w:sz w:val="27"/>
+                <w:szCs w:val="27"/>
+                <w:lang w:val="en-SA"/>
+                <w14:ligatures w14:val="none"/>
+              </w:rPr>
+            </w:pPr>
+          </w:p>
+        </w:tc>
+        <w:tc>
+          <w:tcPr>
+            <w:tcW w:w="1870" w:type="dxa"/>
+          </w:tcPr>
+          <w:p>
+            <w:pPr>
+              <w:spacing w:before="100" w:beforeAutospacing="1" w:after="100" w:afterAutospacing="1"/>
+              <w:outlineLvl w:val="2"/>
+              <w:rPr>
+                <w:rFonts w:ascii="Times New Roman" w:eastAsia="Times New Roman" w:hAnsi="Times New Roman" w:cs="Times New Roman"/>
+                <w:b/>
+                <w:bCs/>
+                <w:kern w:val="0"/>
+                <w:sz w:val="27"/>
+                <w:szCs w:val="27"/>
+                <w:lang w:val="en-SA"/>
+                <w14:ligatures w14:val="none"/>
+              </w:rPr>
+            </w:pPr>
+          </w:p>
+        </w:tc>
+        <w:tc>
+          <w:tcPr>
+            <w:tcW w:w="1870" w:type="dxa"/>
+          </w:tcPr>
+          <w:p>
+            <w:pPr>
+              <w:spacing w:before="100" w:beforeAutospacing="1" w:after="100" w:afterAutospacing="1"/>
+              <w:outlineLvl w:val="2"/>
+              <w:rPr>
+                <w:rFonts w:ascii="Times New Roman" w:eastAsia="Times New Roman" w:hAnsi="Times New Roman" w:cs="Times New Roman"/>
+                <w:b/>
+                <w:bCs/>
+                <w:kern w:val="0"/>
+                <w:sz w:val="27"/>
+                <w:szCs w:val="27"/>
+                <w:lang w:val="en-SA"/>
+                <w14:ligatures w14:val="none"/>
+              </w:rPr>
+            </w:pPr>
+          </w:p>
+        </w:tc>
+      </w:tr>
+      <w:tr>
+        <w:tc>
+          <w:tcPr>
+            <w:tcW w:w="1870" w:type="dxa"/>
+          </w:tcPr>
+          <w:p>
+            <w:pPr>
+              <w:pStyle w:val="p1"/>
+            </w:pPr>
+            <w:r>
+              <w:t xml:space="preserve">Vulnerability </w:t>
+            </w:r>
+          </w:p>
+        </w:tc>
+        <w:tc>
+          <w:tcPr>
+            <w:tcW w:w="1870" w:type="dxa"/>
+          </w:tcPr>
+          <w:p>
+            <w:pPr>
+              <w:pStyle w:val="p1"/>
+            </w:pPr>
+            <w:r>
+              <w:t xml:space="preserve"> Intended Rule(s) </w:t>
+            </w:r>
+          </w:p>
+        </w:tc>
+        <w:tc>
+          <w:tcPr>
+            <w:tcW w:w="1870" w:type="dxa"/>
+          </w:tcPr>
+          <w:p>
+            <w:pPr>
+              <w:pStyle w:val="p1"/>
+            </w:pPr>
+            <w:r>
+              <w:t xml:space="preserve"> Artifacts Used to Infer Rule </w:t>
+            </w:r>
+          </w:p>
+        </w:tc>
+        <w:tc>
+          <w:tcPr>
+            <w:tcW w:w="1870" w:type="dxa"/>
+          </w:tcPr>
+          <w:p>
+            <w:pPr>
+              <w:pStyle w:val="p1"/>
+            </w:pPr>
+            <w:r>
+              <w:t xml:space="preserve"> Normal Behavior Evidence </w:t>
+            </w:r>
+          </w:p>
+        </w:tc>
+        <w:tc>
+          <w:tcPr>
+            <w:tcW w:w="1870" w:type="dxa"/>
+          </w:tcPr>
+          <w:p>
+            <w:pPr>
+              <w:pStyle w:val="p1"/>
+            </w:pPr>
+            <w:r>
+              <w:t xml:space="preserve"> Exploit Behavior Evidence</w:t>
+            </w:r>
+          </w:p>
+        </w:tc>
+      </w:tr>
+      <w:tr>
+        <w:tc>
+          <w:tcPr>
+            <w:tcW w:w="1870" w:type="dxa"/>
+          </w:tcPr>
+          <w:p>
+            <w:pPr>
+              <w:pStyle w:val="p1"/>
+            </w:pPr>
+            <w:r>
+              <w:t xml:space="preserve">Logic Vulnerability (Race Condition / TOCTOU) </w:t>
+            </w:r>
+          </w:p>
+        </w:tc>
+        <w:tc>
+          <w:tcPr>
+            <w:tcW w:w="1870" w:type="dxa"/>
+          </w:tcPr>
+          <w:p>
+            <w:pPr>
+              <w:pStyle w:val="p1"/>
+            </w:pPr>
+            <w:r>
+              <w:t xml:space="preserve"> Billing must reflect final order state; updates must not occur during billing </w:t>
+            </w:r>
+          </w:p>
+        </w:tc>
+        <w:tc>
+          <w:tcPr>
+            <w:tcW w:w="1870" w:type="dxa"/>
+          </w:tcPr>
+          <w:p>
+            <w:pPr>
+              <w:pStyle w:val="p1"/>
+            </w:pPr>
+            <w:r>
+              <w:t xml:space="preserve"> API requests, responses, receipt, request timing </w:t>
+            </w:r>
+          </w:p>
+        </w:tc>
+        <w:tc>
+          <w:tcPr>
+            <w:tcW w:w="1870" w:type="dxa"/>
+          </w:tcPr>
+          <w:p>
+            <w:pPr>
+              <w:pStyle w:val="p1"/>
+            </w:pPr>
+            <w:r>
+              <w:t xml:space="preserve"> Order quantity matches billed total </w:t>
+            </w:r>
+          </w:p>
+        </w:tc>
+        <w:tc>
+          <w:tcPr>
+            <w:tcW w:w="1870" w:type="dxa"/>
+          </w:tcPr>
+          <w:p>
+            <w:pPr>
+              <w:pStyle w:val="p1"/>
+            </w:pPr>
+            <w:r>
+              <w:t xml:space="preserve"> System charged for 1 item while receipt shows 3 items</w:t>
+            </w:r>
+          </w:p>
+        </w:tc>
+      </w:tr>
+    </w:tbl>
+    <w:p>
+      <w:pPr>
+        <w:spacing w:after="0" w:line="240" w:lineRule="auto"/>
+        <w:rPr>
+          <w:rFonts w:ascii="Times New Roman" w:eastAsia="Times New Roman" w:hAnsi="Times New Roman" w:cs="Times New Roman"/>
+          <w:kern w:val="0"/>
+          <w:lang w:val="en-SA"/>
+          <w14:ligatures w14:val="none"/>
+        </w:rPr>
+      </w:pPr>
+      <w:r>
+        <w:rPr>
+          <w:rFonts w:ascii="Times New Roman" w:eastAsia="Times New Roman" w:hAnsi="Times New Roman" w:cs="Times New Roman"/>
+          <w:noProof/>
+          <w:kern w:val="0"/>
+          <w:lang w:val="en-SA"/>
+        </w:rPr>
+        <w:pict w14:anchorId="5257146B">
+          <v:rect id="_x0000_i1026" alt="" style="width:468pt;height:.05pt;mso-width-percent:0;mso-height-percent:0;mso-width-percent:0;mso-height-percent:0" o:hralign="center" o:hrstd="t" o:hr="t" fillcolor="#a0a0a0" stroked="f"/>
+        </w:pict>
+      </w:r>
+    </w:p>
+    <w:p>
+      <w:pPr>
+        <w:spacing w:after="0" w:line="240" w:lineRule="auto"/>
+        <w:rPr>
+          <w:rFonts w:ascii="Times New Roman" w:eastAsia="Times New Roman" w:hAnsi="Times New Roman" w:cs="Times New Roman"/>
+          <w:kern w:val="0"/>
+          <w:lang w:val="en-SA"/>
+          <w14:ligatures w14:val="none"/>
+        </w:rPr>
+      </w:pPr>
+    </w:p>
+    <w:tbl>
+      <w:tblPr>
+        <w:tblStyle w:val="TableGrid"/>
+        <w:tblW w:w="0" w:type="auto"/>
+        <w:tblLook w:val="04A0" w:firstRow="1" w:lastRow="0" w:firstColumn="1" w:lastColumn="0" w:noHBand="0" w:noVBand="1"/>
+      </w:tblPr>
+      <w:tblGrid>
+        <w:gridCol w:w="1558"/>
+        <w:gridCol w:w="1558"/>
+        <w:gridCol w:w="1558"/>
+        <w:gridCol w:w="1558"/>
+        <w:gridCol w:w="1559"/>
+        <w:gridCol w:w="1559"/>
+      </w:tblGrid>
+      <w:tr>
+        <w:tc>
+          <w:tcPr>
+            <w:tcW w:w="1558" w:type="dxa"/>
+          </w:tcPr>
+          <w:p>
+            <w:pPr>
+              <w:pStyle w:val="p1"/>
+            </w:pPr>
+            <w:r>
+              <w:t xml:space="preserve">Vulnerability </w:t>
+            </w:r>
+          </w:p>
+        </w:tc>
+        <w:tc>
+          <w:tcPr>
+            <w:tcW w:w="1558" w:type="dxa"/>
+          </w:tcPr>
+          <w:p>
+            <w:pPr>
+              <w:pStyle w:val="p1"/>
+            </w:pPr>
+            <w:r>
+              <w:t xml:space="preserve"> Why This Is a Deviation </w:t>
+            </w:r>
+          </w:p>
+        </w:tc>
+        <w:tc>
+          <w:tcPr>
+            <w:tcW w:w="1558" w:type="dxa"/>
+          </w:tcPr>
+          <w:p>
+            <w:pPr>
+              <w:pStyle w:val="p1"/>
+            </w:pPr>
+            <w:r>
+              <w:t xml:space="preserve"> Deviation Class </w:t>
+            </w:r>
+          </w:p>
+        </w:tc>
+        <w:tc>
+          <w:tcPr>
+            <w:tcW w:w="1558" w:type="dxa"/>
+          </w:tcPr>
+          <w:p>
+            <w:pPr>
+              <w:pStyle w:val="p1"/>
+            </w:pPr>
+            <w:r>
+              <w:t xml:space="preserve"> Fix Applied (Where) </w:t>
+            </w:r>
+          </w:p>
+        </w:tc>
+        <w:tc>
+          <w:tcPr>
+            <w:tcW w:w="1559" w:type="dxa"/>
+          </w:tcPr>
+          <w:p>
+            <w:pPr>
+              <w:pStyle w:val="p1"/>
+            </w:pPr>
+            <w:r>
+              <w:t xml:space="preserve"> Post-Fix Verification </w:t>
+            </w:r>
+          </w:p>
+        </w:tc>
+        <w:tc>
+          <w:tcPr>
+            <w:tcW w:w="1559" w:type="dxa"/>
+          </w:tcPr>
+          <w:p>
+            <w:pPr>
+              <w:pStyle w:val="p1"/>
+            </w:pPr>
+            <w:r>
+              <w:t xml:space="preserve"> Optional Latency Before / After Logging</w:t>
+            </w:r>
+          </w:p>
+        </w:tc>
+      </w:tr>
+      <w:tr>
+        <w:tc>
+          <w:tcPr>
+            <w:tcW w:w="1558" w:type="dxa"/>
+          </w:tcPr>
+          <w:p>
+            <w:pPr>
+              <w:pStyle w:val="p1"/>
+            </w:pPr>
+            <w:r>
+              <w:t xml:space="preserve">Logic Vulnerability (Race Condition) </w:t>
+            </w:r>
+          </w:p>
+        </w:tc>
+        <w:tc>
+          <w:tcPr>
+            <w:tcW w:w="1558" w:type="dxa"/>
+          </w:tcPr>
+          <w:p>
+            <w:pPr>
+              <w:pStyle w:val="p1"/>
+            </w:pPr>
+            <w:r>
+              <w:t xml:space="preserve"> System allows order modification during billing leading to inconsistent state </w:t>
+            </w:r>
+          </w:p>
+        </w:tc>
+        <w:tc>
+          <w:tcPr>
+            <w:tcW w:w="1558" w:type="dxa"/>
+          </w:tcPr>
+          <w:p>
+            <w:pPr>
+              <w:pStyle w:val="p1"/>
+            </w:pPr>
+            <w:r>
+              <w:t xml:space="preserve"> Intentional misuse / security-relevant abuse </w:t>
+            </w:r>
+          </w:p>
+        </w:tc>
+        <w:tc>
+          <w:tcPr>
+            <w:tcW w:w="1558" w:type="dxa"/>
+          </w:tcPr>
+          <w:p>
+            <w:pPr>
+              <w:pStyle w:val="p1"/>
+            </w:pPr>
+            <w:r>
+              <w:t xml:space="preserve"> Backend Lambda (billing + update logic using conditional expressions and state locking) </w:t>
+            </w:r>
+          </w:p>
+        </w:tc>
+        <w:tc>
+          <w:tcPr>
+            <w:tcW w:w="1559" w:type="dxa"/>
+          </w:tcPr>
+          <w:p>
+            <w:pPr>
+              <w:pStyle w:val="p1"/>
+            </w:pPr>
+            <w:r>
+              <w:t xml:space="preserve"> Update requests rejected during billing; receipt matches billed amount </w:t>
+            </w:r>
+          </w:p>
+        </w:tc>
+        <w:tc>
+          <w:tcPr>
+            <w:tcW w:w="1559" w:type="dxa"/>
+          </w:tcPr>
+          <w:p>
+            <w:pPr>
+              <w:pStyle w:val="p1"/>
+            </w:pPr>
+            <w:r>
+              <w:t xml:space="preserve"> N/A</w:t>
+            </w:r>
+          </w:p>
+        </w:tc>
+      </w:tr>
+    </w:tbl>
+    <w:p>
+      <w:pPr>
+        <w:spacing w:after="0" w:line="240" w:lineRule="auto"/>
+        <w:rPr>
+          <w:rFonts w:ascii="Times New Roman" w:eastAsia="Times New Roman" w:hAnsi="Times New Roman" w:cs="Times New Roman"/>
+          <w:kern w:val="0"/>
+          <w:lang w:val="en-SA"/>
+          <w14:ligatures w14:val="none"/>
+        </w:rPr>
+      </w:pPr>
+      <w:r>
+        <w:rPr>
+          <w:rFonts w:ascii="Times New Roman" w:eastAsia="Times New Roman" w:hAnsi="Times New Roman" w:cs="Times New Roman"/>
+          <w:noProof/>
+          <w:kern w:val="0"/>
+          <w:lang w:val="en-SA"/>
+        </w:rPr>
+        <w:pict w14:anchorId="71B7395D">
+          <v:rect id="_x0000_i1025" alt="" style="width:468pt;height:.05pt;mso-width-percent:0;mso-height-percent:0;mso-width-percent:0;mso-height-percent:0" o:hralign="center" o:hrstd="t" o:hr="t" fillcolor="#a0a0a0" stroked="f"/>
+        </w:pict>
+      </w:r>
+    </w:p>
+    <w:p>
+      <w:pPr>
+        <w:spacing w:before="100" w:beforeAutospacing="1" w:after="100" w:afterAutospacing="1" w:line="240" w:lineRule="auto"/>
+        <w:jc w:val="center"/>
+        <w:outlineLvl w:val="1"/>
+        <w:rPr>
+          <w:rFonts w:ascii="Times New Roman" w:eastAsia="Times New Roman" w:hAnsi="Times New Roman" w:cs="Times New Roman"/>
+          <w:b/>
+          <w:bCs/>
+          <w:i/>
+          <w:iCs/>
+          <w:kern w:val="0"/>
+          <w:sz w:val="36"/>
+          <w:szCs w:val="36"/>
+          <w:lang w:val="en-SA"/>
+          <w14:ligatures w14:val="none"/>
+        </w:rPr>
+      </w:pPr>
+      <w:r>
+        <w:rPr>
+          <w:rFonts w:ascii="Times New Roman" w:eastAsia="Times New Roman" w:hAnsi="Times New Roman" w:cs="Times New Roman"/>
+          <w:b/>
+          <w:bCs/>
+          <w:i/>
+          <w:iCs/>
+          <w:kern w:val="0"/>
+          <w:sz w:val="36"/>
+          <w:szCs w:val="36"/>
+          <w:lang w:val="en-SA"/>
+          <w14:ligatures w14:val="none"/>
+        </w:rPr>
+        <w:t>Takeaway / Lessons Learned</w:t>
+      </w:r>
+    </w:p>
+    <w:p>
+      <w:pPr>
+        <w:spacing w:before="100" w:beforeAutospacing="1" w:after="100" w:afterAutospacing="1" w:line="240" w:lineRule="auto"/>
+        <w:rPr>
+          <w:rFonts w:ascii="Times New Roman" w:eastAsia="Times New Roman" w:hAnsi="Times New Roman" w:cs="Times New Roman"/>
+          <w:kern w:val="0"/>
+          <w:lang w:val="en-SA"/>
+          <w14:ligatures w14:val="none"/>
+        </w:rPr>
+      </w:pPr>
+      <w:r>
+        <w:rPr>
+          <w:rFonts w:ascii="Times New Roman" w:eastAsia="Times New Roman" w:hAnsi="Times New Roman" w:cs="Times New Roman"/>
+          <w:kern w:val="0"/>
+          <w:lang w:val="en-SA"/>
+          <w14:ligatures w14:val="none"/>
+        </w:rPr>
+        <w:t>This lesson highlights the importance of proper request sequencing and state management in application design. Even when authentication and input validation are correctly implemented, logical flaws can still lead to serious vulnerabilities. Race conditions can allow attackers to manipulate system behavior without breaking traditional security controls. Ensuring atomic operations, enforcing strict state transitions, and validating data at critical points are essential to maintaining application integrity and preventing abuse.</w:t>
+      </w:r>
+    </w:p>
+    <w:p>
+      <w:pPr>
+        <w:rPr>
+          <w:lang w:val="en-SA"/>
+        </w:rPr>
+      </w:pPr>
+    </w:p>
     <w:sectPr>
       <w:pgSz w:w="12240" w:h="15840"/>
       <w:pgMar w:top="1440" w:right="1440" w:bottom="1440" w:left="1440" w:header="708" w:footer="708" w:gutter="0"/>
@@ -11,6 +2842,56 @@
     </w:sectPr>
   </w:body>
 </w:document>
+</file>
+
+<file path=word/endnotes.xml><?xml version="1.0" encoding="utf-8"?>
+<w:endnotes xmlns:wpc="http://schemas.microsoft.com/office/word/2010/wordprocessingCanvas" xmlns:cx="http://schemas.microsoft.com/office/drawing/2014/chartex" xmlns:cx1="http://schemas.microsoft.com/office/drawing/2015/9/8/chartex" xmlns:cx2="http://schemas.microsoft.com/office/drawing/2015/10/21/chartex" xmlns:cx3="http://schemas.microsoft.com/office/drawing/2016/5/9/chartex" xmlns:cx4="http://schemas.microsoft.com/office/drawing/2016/5/10/chartex" xmlns:cx5="http://schemas.microsoft.com/office/drawing/2016/5/11/chartex" xmlns:cx6="http://schemas.microsoft.com/office/drawing/2016/5/12/chartex" xmlns:cx7="http://schemas.microsoft.com/office/drawing/2016/5/13/chartex" xmlns:cx8="http://schemas.microsoft.com/office/drawing/2016/5/14/chartex" xmlns:mc="http://schemas.openxmlformats.org/markup-compatibility/2006" xmlns:aink="http://schemas.microsoft.com/office/drawing/2016/ink" xmlns:am3d="http://schemas.microsoft.com/office/drawing/2017/model3d" xmlns:o="urn:schemas-microsoft-com:office:office" xmlns:oel="http://schemas.microsoft.com/office/2019/extlst" xmlns:r="http://schemas.openxmlformats.org/officeDocument/2006/relationships" xmlns:m="http://schemas.openxmlformats.org/officeDocument/2006/math" xmlns:v="urn:schemas-microsoft-com:vml" xmlns:wp14="http://schemas.microsoft.com/office/word/2010/wordprocessingDrawing" xmlns:wp="http://schemas.openxmlformats.org/drawingml/2006/wordprocessingDrawing" xmlns:w10="urn:schemas-microsoft-com:office:word" xmlns:w="http://schemas.openxmlformats.org/wordprocessingml/2006/main" xmlns:w14="http://schemas.microsoft.com/office/word/2010/wordml" xmlns:w15="http://schemas.microsoft.com/office/word/2012/wordml" xmlns:w16cex="http://schemas.microsoft.com/office/word/2018/wordml/cex" xmlns:w16cid="http://schemas.microsoft.com/office/word/2016/wordml/cid" xmlns:w16="http://schemas.microsoft.com/office/word/2018/wordml" xmlns:w16du="http://schemas.microsoft.com/office/word/2023/wordml/word16du" xmlns:w16sdtdh="http://schemas.microsoft.com/office/word/2020/wordml/sdtdatahash" xmlns:w16sdtfl="http://schemas.microsoft.com/office/word/2024/wordml/sdtformatlock" xmlns:w16se="http://schemas.microsoft.com/office/word/2015/wordml/symex" xmlns:wpg="http://schemas.microsoft.com/office/word/2010/wordprocessingGroup" xmlns:wpi="http://schemas.microsoft.com/office/word/2010/wordprocessingInk" xmlns:wne="http://schemas.microsoft.com/office/word/2006/wordml" xmlns:wps="http://schemas.microsoft.com/office/word/2010/wordprocessingShape" mc:Ignorable="w14 w15 w16se w16cid w16 w16cex w16sdtdh w16sdtfl w16du wp14">
+  <w:endnote w:type="separator" w:id="-1">
+    <w:p>
+      <w:pPr>
+        <w:spacing w:after="0" w:line="240" w:lineRule="auto"/>
+      </w:pPr>
+      <w:r>
+        <w:separator/>
+      </w:r>
+    </w:p>
+  </w:endnote>
+  <w:endnote w:type="continuationSeparator" w:id="0">
+    <w:p>
+      <w:pPr>
+        <w:spacing w:after="0" w:line="240" w:lineRule="auto"/>
+      </w:pPr>
+      <w:r>
+        <w:continuationSeparator/>
+      </w:r>
+    </w:p>
+  </w:endnote>
+</w:endnotes>
+</file>
+
+<file path=word/footnotes.xml><?xml version="1.0" encoding="utf-8"?>
+<w:footnotes xmlns:wpc="http://schemas.microsoft.com/office/word/2010/wordprocessingCanvas" xmlns:cx="http://schemas.microsoft.com/office/drawing/2014/chartex" xmlns:cx1="http://schemas.microsoft.com/office/drawing/2015/9/8/chartex" xmlns:cx2="http://schemas.microsoft.com/office/drawing/2015/10/21/chartex" xmlns:cx3="http://schemas.microsoft.com/office/drawing/2016/5/9/chartex" xmlns:cx4="http://schemas.microsoft.com/office/drawing/2016/5/10/chartex" xmlns:cx5="http://schemas.microsoft.com/office/drawing/2016/5/11/chartex" xmlns:cx6="http://schemas.microsoft.com/office/drawing/2016/5/12/chartex" xmlns:cx7="http://schemas.microsoft.com/office/drawing/2016/5/13/chartex" xmlns:cx8="http://schemas.microsoft.com/office/drawing/2016/5/14/chartex" xmlns:mc="http://schemas.openxmlformats.org/markup-compatibility/2006" xmlns:aink="http://schemas.microsoft.com/office/drawing/2016/ink" xmlns:am3d="http://schemas.microsoft.com/office/drawing/2017/model3d" xmlns:o="urn:schemas-microsoft-com:office:office" xmlns:oel="http://schemas.microsoft.com/office/2019/extlst" xmlns:r="http://schemas.openxmlformats.org/officeDocument/2006/relationships" xmlns:m="http://schemas.openxmlformats.org/officeDocument/2006/math" xmlns:v="urn:schemas-microsoft-com:vml" xmlns:wp14="http://schemas.microsoft.com/office/word/2010/wordprocessingDrawing" xmlns:wp="http://schemas.openxmlformats.org/drawingml/2006/wordprocessingDrawing" xmlns:w10="urn:schemas-microsoft-com:office:word" xmlns:w="http://schemas.openxmlformats.org/wordprocessingml/2006/main" xmlns:w14="http://schemas.microsoft.com/office/word/2010/wordml" xmlns:w15="http://schemas.microsoft.com/office/word/2012/wordml" xmlns:w16cex="http://schemas.microsoft.com/office/word/2018/wordml/cex" xmlns:w16cid="http://schemas.microsoft.com/office/word/2016/wordml/cid" xmlns:w16="http://schemas.microsoft.com/office/word/2018/wordml" xmlns:w16du="http://schemas.microsoft.com/office/word/2023/wordml/word16du" xmlns:w16sdtdh="http://schemas.microsoft.com/office/word/2020/wordml/sdtdatahash" xmlns:w16sdtfl="http://schemas.microsoft.com/office/word/2024/wordml/sdtformatlock" xmlns:w16se="http://schemas.microsoft.com/office/word/2015/wordml/symex" xmlns:wpg="http://schemas.microsoft.com/office/word/2010/wordprocessingGroup" xmlns:wpi="http://schemas.microsoft.com/office/word/2010/wordprocessingInk" xmlns:wne="http://schemas.microsoft.com/office/word/2006/wordml" xmlns:wps="http://schemas.microsoft.com/office/word/2010/wordprocessingShape" mc:Ignorable="w14 w15 w16se w16cid w16 w16cex w16sdtdh w16sdtfl w16du wp14">
+  <w:footnote w:type="separator" w:id="-1">
+    <w:p>
+      <w:pPr>
+        <w:spacing w:after="0" w:line="240" w:lineRule="auto"/>
+      </w:pPr>
+      <w:r>
+        <w:separator/>
+      </w:r>
+    </w:p>
+  </w:footnote>
+  <w:footnote w:type="continuationSeparator" w:id="0">
+    <w:p>
+      <w:pPr>
+        <w:spacing w:after="0" w:line="240" w:lineRule="auto"/>
+      </w:pPr>
+      <w:r>
+        <w:continuationSeparator/>
+      </w:r>
+    </w:p>
+  </w:footnote>
+</w:footnotes>
 </file>
 
 <file path=word/styles.xml><?xml version="1.0" encoding="utf-8"?>
@@ -413,6 +3294,10 @@
   <w:style w:type="paragraph" w:default="1" w:styleId="Normal">
     <w:name w:val="Normal"/>
     <w:qFormat/>
+    <w:rsid w:val="00BB1062"/>
+    <w:rPr>
+      <w:lang w:val="en-US"/>
+    </w:rPr>
   </w:style>
   <w:style w:type="paragraph" w:styleId="Heading1">
     <w:name w:val="heading 1"/>
@@ -421,7 +3306,7 @@
     <w:link w:val="Heading1Char"/>
     <w:uiPriority w:val="9"/>
     <w:qFormat/>
-    <w:rsid w:val="00663B58"/>
+    <w:rsid w:val="00BB1062"/>
     <w:pPr>
       <w:keepNext/>
       <w:keepLines/>
@@ -441,10 +3326,9 @@
     <w:next w:val="Normal"/>
     <w:link w:val="Heading2Char"/>
     <w:uiPriority w:val="9"/>
-    <w:semiHidden/>
     <w:unhideWhenUsed/>
     <w:qFormat/>
-    <w:rsid w:val="00663B58"/>
+    <w:rsid w:val="00BB1062"/>
     <w:pPr>
       <w:keepNext/>
       <w:keepLines/>
@@ -464,10 +3348,9 @@
     <w:next w:val="Normal"/>
     <w:link w:val="Heading3Char"/>
     <w:uiPriority w:val="9"/>
-    <w:semiHidden/>
     <w:unhideWhenUsed/>
     <w:qFormat/>
-    <w:rsid w:val="00663B58"/>
+    <w:rsid w:val="00BB1062"/>
     <w:pPr>
       <w:keepNext/>
       <w:keepLines/>
@@ -490,7 +3373,7 @@
     <w:semiHidden/>
     <w:unhideWhenUsed/>
     <w:qFormat/>
-    <w:rsid w:val="00663B58"/>
+    <w:rsid w:val="00BB1062"/>
     <w:pPr>
       <w:keepNext/>
       <w:keepLines/>
@@ -513,7 +3396,7 @@
     <w:semiHidden/>
     <w:unhideWhenUsed/>
     <w:qFormat/>
-    <w:rsid w:val="00663B58"/>
+    <w:rsid w:val="00BB1062"/>
     <w:pPr>
       <w:keepNext/>
       <w:keepLines/>
@@ -534,7 +3417,7 @@
     <w:semiHidden/>
     <w:unhideWhenUsed/>
     <w:qFormat/>
-    <w:rsid w:val="00663B58"/>
+    <w:rsid w:val="00BB1062"/>
     <w:pPr>
       <w:keepNext/>
       <w:keepLines/>
@@ -557,7 +3440,7 @@
     <w:semiHidden/>
     <w:unhideWhenUsed/>
     <w:qFormat/>
-    <w:rsid w:val="00663B58"/>
+    <w:rsid w:val="00BB1062"/>
     <w:pPr>
       <w:keepNext/>
       <w:keepLines/>
@@ -578,7 +3461,7 @@
     <w:semiHidden/>
     <w:unhideWhenUsed/>
     <w:qFormat/>
-    <w:rsid w:val="00663B58"/>
+    <w:rsid w:val="00BB1062"/>
     <w:pPr>
       <w:keepNext/>
       <w:keepLines/>
@@ -601,7 +3484,7 @@
     <w:semiHidden/>
     <w:unhideWhenUsed/>
     <w:qFormat/>
-    <w:rsid w:val="00663B58"/>
+    <w:rsid w:val="00BB1062"/>
     <w:pPr>
       <w:keepNext/>
       <w:keepLines/>
@@ -645,7 +3528,7 @@
     <w:basedOn w:val="DefaultParagraphFont"/>
     <w:link w:val="Heading1"/>
     <w:uiPriority w:val="9"/>
-    <w:rsid w:val="00663B58"/>
+    <w:rsid w:val="00BB1062"/>
     <w:rPr>
       <w:rFonts w:asciiTheme="majorHAnsi" w:eastAsiaTheme="majorEastAsia" w:hAnsiTheme="majorHAnsi" w:cstheme="majorBidi"/>
       <w:color w:val="0F4761" w:themeColor="accent1" w:themeShade="BF"/>
@@ -658,8 +3541,7 @@
     <w:basedOn w:val="DefaultParagraphFont"/>
     <w:link w:val="Heading2"/>
     <w:uiPriority w:val="9"/>
-    <w:semiHidden/>
-    <w:rsid w:val="00663B58"/>
+    <w:rsid w:val="00BB1062"/>
     <w:rPr>
       <w:rFonts w:asciiTheme="majorHAnsi" w:eastAsiaTheme="majorEastAsia" w:hAnsiTheme="majorHAnsi" w:cstheme="majorBidi"/>
       <w:color w:val="0F4761" w:themeColor="accent1" w:themeShade="BF"/>
@@ -672,8 +3554,7 @@
     <w:basedOn w:val="DefaultParagraphFont"/>
     <w:link w:val="Heading3"/>
     <w:uiPriority w:val="9"/>
-    <w:semiHidden/>
-    <w:rsid w:val="00663B58"/>
+    <w:rsid w:val="00BB1062"/>
     <w:rPr>
       <w:rFonts w:eastAsiaTheme="majorEastAsia" w:cstheme="majorBidi"/>
       <w:color w:val="0F4761" w:themeColor="accent1" w:themeShade="BF"/>
@@ -687,7 +3568,7 @@
     <w:link w:val="Heading4"/>
     <w:uiPriority w:val="9"/>
     <w:semiHidden/>
-    <w:rsid w:val="00663B58"/>
+    <w:rsid w:val="00BB1062"/>
     <w:rPr>
       <w:rFonts w:eastAsiaTheme="majorEastAsia" w:cstheme="majorBidi"/>
       <w:i/>
@@ -701,7 +3582,7 @@
     <w:link w:val="Heading5"/>
     <w:uiPriority w:val="9"/>
     <w:semiHidden/>
-    <w:rsid w:val="00663B58"/>
+    <w:rsid w:val="00BB1062"/>
     <w:rPr>
       <w:rFonts w:eastAsiaTheme="majorEastAsia" w:cstheme="majorBidi"/>
       <w:color w:val="0F4761" w:themeColor="accent1" w:themeShade="BF"/>
@@ -713,7 +3594,7 @@
     <w:link w:val="Heading6"/>
     <w:uiPriority w:val="9"/>
     <w:semiHidden/>
-    <w:rsid w:val="00663B58"/>
+    <w:rsid w:val="00BB1062"/>
     <w:rPr>
       <w:rFonts w:eastAsiaTheme="majorEastAsia" w:cstheme="majorBidi"/>
       <w:i/>
@@ -727,7 +3608,7 @@
     <w:link w:val="Heading7"/>
     <w:uiPriority w:val="9"/>
     <w:semiHidden/>
-    <w:rsid w:val="00663B58"/>
+    <w:rsid w:val="00BB1062"/>
     <w:rPr>
       <w:rFonts w:eastAsiaTheme="majorEastAsia" w:cstheme="majorBidi"/>
       <w:color w:val="595959" w:themeColor="text1" w:themeTint="A6"/>
@@ -739,7 +3620,7 @@
     <w:link w:val="Heading8"/>
     <w:uiPriority w:val="9"/>
     <w:semiHidden/>
-    <w:rsid w:val="00663B58"/>
+    <w:rsid w:val="00BB1062"/>
     <w:rPr>
       <w:rFonts w:eastAsiaTheme="majorEastAsia" w:cstheme="majorBidi"/>
       <w:i/>
@@ -753,7 +3634,7 @@
     <w:link w:val="Heading9"/>
     <w:uiPriority w:val="9"/>
     <w:semiHidden/>
-    <w:rsid w:val="00663B58"/>
+    <w:rsid w:val="00BB1062"/>
     <w:rPr>
       <w:rFonts w:eastAsiaTheme="majorEastAsia" w:cstheme="majorBidi"/>
       <w:color w:val="272727" w:themeColor="text1" w:themeTint="D8"/>
@@ -766,7 +3647,7 @@
     <w:link w:val="TitleChar"/>
     <w:uiPriority w:val="10"/>
     <w:qFormat/>
-    <w:rsid w:val="00663B58"/>
+    <w:rsid w:val="00BB1062"/>
     <w:pPr>
       <w:spacing w:after="80" w:line="240" w:lineRule="auto"/>
       <w:contextualSpacing/>
@@ -784,7 +3665,7 @@
     <w:basedOn w:val="DefaultParagraphFont"/>
     <w:link w:val="Title"/>
     <w:uiPriority w:val="10"/>
-    <w:rsid w:val="00663B58"/>
+    <w:rsid w:val="00BB1062"/>
     <w:rPr>
       <w:rFonts w:asciiTheme="majorHAnsi" w:eastAsiaTheme="majorEastAsia" w:hAnsiTheme="majorHAnsi" w:cstheme="majorBidi"/>
       <w:spacing w:val="-10"/>
@@ -800,7 +3681,7 @@
     <w:link w:val="SubtitleChar"/>
     <w:uiPriority w:val="11"/>
     <w:qFormat/>
-    <w:rsid w:val="00663B58"/>
+    <w:rsid w:val="00BB1062"/>
     <w:pPr>
       <w:numPr>
         <w:ilvl w:val="1"/>
@@ -819,7 +3700,7 @@
     <w:basedOn w:val="DefaultParagraphFont"/>
     <w:link w:val="Subtitle"/>
     <w:uiPriority w:val="11"/>
-    <w:rsid w:val="00663B58"/>
+    <w:rsid w:val="00BB1062"/>
     <w:rPr>
       <w:rFonts w:eastAsiaTheme="majorEastAsia" w:cstheme="majorBidi"/>
       <w:color w:val="595959" w:themeColor="text1" w:themeTint="A6"/>
@@ -835,7 +3716,7 @@
     <w:link w:val="QuoteChar"/>
     <w:uiPriority w:val="29"/>
     <w:qFormat/>
-    <w:rsid w:val="00663B58"/>
+    <w:rsid w:val="00BB1062"/>
     <w:pPr>
       <w:spacing w:before="160"/>
       <w:jc w:val="center"/>
@@ -851,7 +3732,7 @@
     <w:basedOn w:val="DefaultParagraphFont"/>
     <w:link w:val="Quote"/>
     <w:uiPriority w:val="29"/>
-    <w:rsid w:val="00663B58"/>
+    <w:rsid w:val="00BB1062"/>
     <w:rPr>
       <w:i/>
       <w:iCs/>
@@ -863,7 +3744,7 @@
     <w:basedOn w:val="Normal"/>
     <w:uiPriority w:val="34"/>
     <w:qFormat/>
-    <w:rsid w:val="00663B58"/>
+    <w:rsid w:val="00BB1062"/>
     <w:pPr>
       <w:ind w:left="720"/>
       <w:contextualSpacing/>
@@ -874,7 +3755,7 @@
     <w:basedOn w:val="DefaultParagraphFont"/>
     <w:uiPriority w:val="21"/>
     <w:qFormat/>
-    <w:rsid w:val="00663B58"/>
+    <w:rsid w:val="00BB1062"/>
     <w:rPr>
       <w:i/>
       <w:iCs/>
@@ -888,7 +3769,7 @@
     <w:link w:val="IntenseQuoteChar"/>
     <w:uiPriority w:val="30"/>
     <w:qFormat/>
-    <w:rsid w:val="00663B58"/>
+    <w:rsid w:val="00BB1062"/>
     <w:pPr>
       <w:pBdr>
         <w:top w:val="single" w:sz="4" w:space="10" w:color="0F4761" w:themeColor="accent1" w:themeShade="BF"/>
@@ -909,7 +3790,7 @@
     <w:basedOn w:val="DefaultParagraphFont"/>
     <w:link w:val="IntenseQuote"/>
     <w:uiPriority w:val="30"/>
-    <w:rsid w:val="00663B58"/>
+    <w:rsid w:val="00BB1062"/>
     <w:rPr>
       <w:i/>
       <w:iCs/>
@@ -921,7 +3802,7 @@
     <w:basedOn w:val="DefaultParagraphFont"/>
     <w:uiPriority w:val="32"/>
     <w:qFormat/>
-    <w:rsid w:val="00663B58"/>
+    <w:rsid w:val="00BB1062"/>
     <w:rPr>
       <w:b/>
       <w:bCs/>
@@ -929,6 +3810,151 @@
       <w:color w:val="0F4761" w:themeColor="accent1" w:themeShade="BF"/>
       <w:spacing w:val="5"/>
     </w:rPr>
+  </w:style>
+  <w:style w:type="character" w:styleId="Hyperlink">
+    <w:name w:val="Hyperlink"/>
+    <w:basedOn w:val="DefaultParagraphFont"/>
+    <w:uiPriority w:val="99"/>
+    <w:unhideWhenUsed/>
+    <w:rsid w:val="00BB1062"/>
+    <w:rPr>
+      <w:color w:val="467886" w:themeColor="hyperlink"/>
+      <w:u w:val="single"/>
+    </w:rPr>
+  </w:style>
+  <w:style w:type="character" w:customStyle="1" w:styleId="s1">
+    <w:name w:val="s1"/>
+    <w:basedOn w:val="DefaultParagraphFont"/>
+    <w:rsid w:val="00BB1062"/>
+  </w:style>
+  <w:style w:type="paragraph" w:customStyle="1" w:styleId="p2">
+    <w:name w:val="p2"/>
+    <w:basedOn w:val="Normal"/>
+    <w:rsid w:val="00BB1062"/>
+    <w:pPr>
+      <w:spacing w:before="100" w:beforeAutospacing="1" w:after="100" w:afterAutospacing="1" w:line="240" w:lineRule="auto"/>
+    </w:pPr>
+    <w:rPr>
+      <w:rFonts w:ascii="Times New Roman" w:eastAsia="Times New Roman" w:hAnsi="Times New Roman" w:cs="Times New Roman"/>
+      <w:kern w:val="0"/>
+      <w:lang w:val="en-SA"/>
+      <w14:ligatures w14:val="none"/>
+    </w:rPr>
+  </w:style>
+  <w:style w:type="paragraph" w:customStyle="1" w:styleId="p3">
+    <w:name w:val="p3"/>
+    <w:basedOn w:val="Normal"/>
+    <w:rsid w:val="00BB1062"/>
+    <w:pPr>
+      <w:spacing w:before="100" w:beforeAutospacing="1" w:after="100" w:afterAutospacing="1" w:line="240" w:lineRule="auto"/>
+    </w:pPr>
+    <w:rPr>
+      <w:rFonts w:ascii="Times New Roman" w:eastAsia="Times New Roman" w:hAnsi="Times New Roman" w:cs="Times New Roman"/>
+      <w:kern w:val="0"/>
+      <w:lang w:val="en-SA"/>
+      <w14:ligatures w14:val="none"/>
+    </w:rPr>
+  </w:style>
+  <w:style w:type="character" w:styleId="HTMLCode">
+    <w:name w:val="HTML Code"/>
+    <w:basedOn w:val="DefaultParagraphFont"/>
+    <w:uiPriority w:val="99"/>
+    <w:semiHidden/>
+    <w:unhideWhenUsed/>
+    <w:rsid w:val="00BB1062"/>
+    <w:rPr>
+      <w:rFonts w:ascii="Courier New" w:eastAsia="Times New Roman" w:hAnsi="Courier New" w:cs="Courier New"/>
+      <w:sz w:val="20"/>
+      <w:szCs w:val="20"/>
+    </w:rPr>
+  </w:style>
+  <w:style w:type="character" w:customStyle="1" w:styleId="apple-tab-span">
+    <w:name w:val="apple-tab-span"/>
+    <w:basedOn w:val="DefaultParagraphFont"/>
+    <w:rsid w:val="00BB1062"/>
+  </w:style>
+  <w:style w:type="paragraph" w:styleId="Header">
+    <w:name w:val="header"/>
+    <w:basedOn w:val="Normal"/>
+    <w:link w:val="HeaderChar"/>
+    <w:uiPriority w:val="99"/>
+    <w:unhideWhenUsed/>
+    <w:rsid w:val="00BB1062"/>
+    <w:pPr>
+      <w:tabs>
+        <w:tab w:val="center" w:pos="4680"/>
+        <w:tab w:val="right" w:pos="9360"/>
+      </w:tabs>
+      <w:spacing w:after="0" w:line="240" w:lineRule="auto"/>
+    </w:pPr>
+  </w:style>
+  <w:style w:type="character" w:customStyle="1" w:styleId="HeaderChar">
+    <w:name w:val="Header Char"/>
+    <w:basedOn w:val="DefaultParagraphFont"/>
+    <w:link w:val="Header"/>
+    <w:uiPriority w:val="99"/>
+    <w:rsid w:val="00BB1062"/>
+    <w:rPr>
+      <w:lang w:val="en-US"/>
+    </w:rPr>
+  </w:style>
+  <w:style w:type="paragraph" w:styleId="Footer">
+    <w:name w:val="footer"/>
+    <w:basedOn w:val="Normal"/>
+    <w:link w:val="FooterChar"/>
+    <w:uiPriority w:val="99"/>
+    <w:unhideWhenUsed/>
+    <w:rsid w:val="00BB1062"/>
+    <w:pPr>
+      <w:tabs>
+        <w:tab w:val="center" w:pos="4680"/>
+        <w:tab w:val="right" w:pos="9360"/>
+      </w:tabs>
+      <w:spacing w:after="0" w:line="240" w:lineRule="auto"/>
+    </w:pPr>
+  </w:style>
+  <w:style w:type="character" w:customStyle="1" w:styleId="FooterChar">
+    <w:name w:val="Footer Char"/>
+    <w:basedOn w:val="DefaultParagraphFont"/>
+    <w:link w:val="Footer"/>
+    <w:uiPriority w:val="99"/>
+    <w:rsid w:val="00BB1062"/>
+    <w:rPr>
+      <w:lang w:val="en-US"/>
+    </w:rPr>
+  </w:style>
+  <w:style w:type="paragraph" w:customStyle="1" w:styleId="p1">
+    <w:name w:val="p1"/>
+    <w:basedOn w:val="Normal"/>
+    <w:rsid w:val="005D148D"/>
+    <w:pPr>
+      <w:spacing w:before="100" w:beforeAutospacing="1" w:after="100" w:afterAutospacing="1" w:line="240" w:lineRule="auto"/>
+    </w:pPr>
+    <w:rPr>
+      <w:rFonts w:ascii="Times New Roman" w:eastAsia="Times New Roman" w:hAnsi="Times New Roman" w:cs="Times New Roman"/>
+      <w:kern w:val="0"/>
+      <w:lang w:val="en-SA"/>
+      <w14:ligatures w14:val="none"/>
+    </w:rPr>
+  </w:style>
+  <w:style w:type="table" w:styleId="TableGrid">
+    <w:name w:val="Table Grid"/>
+    <w:basedOn w:val="TableNormal"/>
+    <w:uiPriority w:val="39"/>
+    <w:rsid w:val="005D148D"/>
+    <w:pPr>
+      <w:spacing w:after="0" w:line="240" w:lineRule="auto"/>
+    </w:pPr>
+    <w:tblPr>
+      <w:tblBorders>
+        <w:top w:val="single" w:sz="4" w:space="0" w:color="auto"/>
+        <w:left w:val="single" w:sz="4" w:space="0" w:color="auto"/>
+        <w:bottom w:val="single" w:sz="4" w:space="0" w:color="auto"/>
+        <w:right w:val="single" w:sz="4" w:space="0" w:color="auto"/>
+        <w:insideH w:val="single" w:sz="4" w:space="0" w:color="auto"/>
+        <w:insideV w:val="single" w:sz="4" w:space="0" w:color="auto"/>
+      </w:tblBorders>
+    </w:tblPr>
   </w:style>
 </w:styles>
 </file>

</xml_diff>